<commit_message>
Regenerate tracking integration docx
</commit_message>
<xml_diff>
--- a/Tracking_Integration_Roadmap.docx
+++ b/Tracking_Integration_Roadmap.docx
@@ -13,7 +13,7 @@
           <w:color w:val="1A376C"/>
           <w:sz w:val="48"/>
         </w:rPr>
-        <w:t>Tracking Integration &amp; Logistics Platform Roadmap</w:t>
+        <w:t>Tracking System Integration &amp; Logistics Platform Enhancement Plan</w:t>
       </w:r>
     </w:p>
     <w:p>
@@ -130,7 +130,7 @@
                 <w:color w:val="404040"/>
                 <w:sz w:val="21"/>
               </w:rPr>
-              <w:t>Tracking Integration Roadmap</w:t>
+              <w:t>Tracking Integration &amp; Logistics Platform Enhancement Plan</w:t>
             </w:r>
           </w:p>
         </w:tc>
@@ -235,7 +235,7 @@
           <w:color w:val="FFFFFF"/>
           <w:sz w:val="26"/>
         </w:rPr>
-        <w:t xml:space="preserve">  1.  Executive Overview</w:t>
+        <w:t xml:space="preserve">  1.  Executive Summary</w:t>
       </w:r>
     </w:p>
     <w:p>
@@ -247,7 +247,34 @@
           <w:color w:val="404040"/>
           <w:sz w:val="21"/>
         </w:rPr>
-        <w:t>With the Production MVP complete, the next stage focuses on delivering a tracking-first logistics platform. The roadmap below connects vehicles, shipments, and telemetry into a single operational view while progressively unlocking automation, auditing, and performance intelligence.</w:t>
+        <w:t>Following the completion of the Production MVP, the next development phase focuses on integrating a comprehensive shipment tracking capability into the logistics platform. This enhancement will provide real-time visibility into shipment movement, improve operational oversight, strengthen customer confidence, and establish the foundation for future logistics intelligence features.</w:t>
+      </w:r>
+    </w:p>
+    <w:p>
+      <w:pPr>
+        <w:spacing w:after="120"/>
+      </w:pPr>
+      <w:r>
+        <w:rPr>
+          <w:color w:val="404040"/>
+          <w:sz w:val="21"/>
+        </w:rPr>
+        <w:t>The tracking integration will be implemented in phases to ensure stability, scalability, and measurable business value.</w:t>
+      </w:r>
+    </w:p>
+    <w:p>
+      <w:pPr>
+        <w:pStyle w:val="Heading1"/>
+        <w:spacing w:before="280" w:after="120"/>
+        <w:shd w:val="clear" w:color="auto" w:fill="1A376C"/>
+      </w:pPr>
+      <w:r>
+        <w:rPr>
+          <w:b/>
+          <w:color w:val="FFFFFF"/>
+          <w:sz w:val="26"/>
+        </w:rPr>
+        <w:t xml:space="preserve">  2.  Phase 1: Tracking Infrastructure Integration</w:t>
       </w:r>
     </w:p>
     <w:p>
@@ -261,7 +288,47 @@
           <w:color w:val="007B83"/>
           <w:sz w:val="22"/>
         </w:rPr>
-        <w:t>Primary Outcomes</w:t>
+        <w:t>Objective</w:t>
+      </w:r>
+    </w:p>
+    <w:p>
+      <w:pPr>
+        <w:spacing w:after="120"/>
+      </w:pPr>
+      <w:r>
+        <w:rPr>
+          <w:color w:val="404040"/>
+          <w:sz w:val="21"/>
+        </w:rPr>
+        <w:t>Establish the technical foundation required to connect vehicles, shipments, and location data.</w:t>
+      </w:r>
+    </w:p>
+    <w:p>
+      <w:pPr>
+        <w:pStyle w:val="Heading2"/>
+        <w:spacing w:before="200" w:after="80"/>
+      </w:pPr>
+      <w:r>
+        <w:rPr>
+          <w:b/>
+          <w:color w:val="007B83"/>
+          <w:sz w:val="22"/>
+        </w:rPr>
+        <w:t>Scope</w:t>
+      </w:r>
+    </w:p>
+    <w:p>
+      <w:pPr>
+        <w:pStyle w:val="Heading2"/>
+        <w:spacing w:before="200" w:after="80"/>
+      </w:pPr>
+      <w:r>
+        <w:rPr>
+          <w:b/>
+          <w:color w:val="007B83"/>
+          <w:sz w:val="22"/>
+        </w:rPr>
+        <w:t>Vehicle Management</w:t>
       </w:r>
     </w:p>
     <w:p>
@@ -275,14 +342,7 @@
           <w:color w:val="1A376C"/>
           <w:sz w:val="21"/>
         </w:rPr>
-        <w:t>Real-time visibility:</w:t>
-      </w:r>
-      <w:r>
-        <w:rPr>
-          <w:color w:val="404040"/>
-          <w:sz w:val="21"/>
-        </w:rPr>
-        <w:t xml:space="preserve"> Give stakeholders an always-current view of shipment movement and status.</w:t>
+        <w:t>Register vehicles within the platform</w:t>
       </w:r>
     </w:p>
     <w:p>
@@ -296,14 +356,7 @@
           <w:color w:val="1A376C"/>
           <w:sz w:val="21"/>
         </w:rPr>
-        <w:t>Operational confidence:</w:t>
-      </w:r>
-      <w:r>
-        <w:rPr>
-          <w:color w:val="404040"/>
-          <w:sz w:val="21"/>
-        </w:rPr>
-        <w:t xml:space="preserve"> Reduce manual status checks and improve exception response times.</w:t>
+        <w:t>Associate vehicles with carriers</w:t>
       </w:r>
     </w:p>
     <w:p>
@@ -317,14 +370,301 @@
           <w:color w:val="1A376C"/>
           <w:sz w:val="21"/>
         </w:rPr>
-        <w:t>Scalable foundation:</w:t>
+        <w:t>Maintain vehicle profiles and identification information</w:t>
       </w:r>
+    </w:p>
+    <w:p>
+      <w:pPr>
+        <w:pStyle w:val="Heading2"/>
+        <w:spacing w:before="200" w:after="80"/>
+      </w:pPr>
       <w:r>
         <w:rPr>
-          <w:color w:val="404040"/>
+          <w:b/>
+          <w:color w:val="007B83"/>
+          <w:sz w:val="22"/>
+        </w:rPr>
+        <w:t>Shipment-Vehicle Assignment</w:t>
+      </w:r>
+    </w:p>
+    <w:p>
+      <w:pPr>
+        <w:pStyle w:val="ListBullet"/>
+        <w:spacing w:after="80"/>
+      </w:pPr>
+      <w:r>
+        <w:rPr>
+          <w:b/>
+          <w:color w:val="1A376C"/>
           <w:sz w:val="21"/>
         </w:rPr>
-        <w:t xml:space="preserve"> Standardize tracking data to support automation and analytics later phases.</w:t>
+        <w:t>Link assigned shipments to vehicles</w:t>
+      </w:r>
+    </w:p>
+    <w:p>
+      <w:pPr>
+        <w:pStyle w:val="ListBullet"/>
+        <w:spacing w:after="80"/>
+      </w:pPr>
+      <w:r>
+        <w:rPr>
+          <w:b/>
+          <w:color w:val="1A376C"/>
+          <w:sz w:val="21"/>
+        </w:rPr>
+        <w:t>Track active shipment-vehicle relationships</w:t>
+      </w:r>
+    </w:p>
+    <w:p>
+      <w:pPr>
+        <w:pStyle w:val="ListBullet"/>
+        <w:spacing w:after="80"/>
+      </w:pPr>
+      <w:r>
+        <w:rPr>
+          <w:b/>
+          <w:color w:val="1A376C"/>
+          <w:sz w:val="21"/>
+        </w:rPr>
+        <w:t>Maintain assignment history</w:t>
+      </w:r>
+    </w:p>
+    <w:p>
+      <w:pPr>
+        <w:pStyle w:val="Heading2"/>
+        <w:spacing w:before="200" w:after="80"/>
+      </w:pPr>
+      <w:r>
+        <w:rPr>
+          <w:b/>
+          <w:color w:val="007B83"/>
+          <w:sz w:val="22"/>
+        </w:rPr>
+        <w:t>Tracking Data Integration</w:t>
+      </w:r>
+    </w:p>
+    <w:p>
+      <w:pPr>
+        <w:pStyle w:val="ListBullet"/>
+        <w:spacing w:after="80"/>
+      </w:pPr>
+      <w:r>
+        <w:rPr>
+          <w:b/>
+          <w:color w:val="1A376C"/>
+          <w:sz w:val="21"/>
+        </w:rPr>
+        <w:t>Receive and process location updates</w:t>
+      </w:r>
+    </w:p>
+    <w:p>
+      <w:pPr>
+        <w:pStyle w:val="ListBullet"/>
+        <w:spacing w:after="80"/>
+      </w:pPr>
+      <w:r>
+        <w:rPr>
+          <w:b/>
+          <w:color w:val="1A376C"/>
+          <w:sz w:val="21"/>
+        </w:rPr>
+        <w:t>Store current vehicle position information</w:t>
+      </w:r>
+    </w:p>
+    <w:p>
+      <w:pPr>
+        <w:pStyle w:val="ListBullet"/>
+        <w:spacing w:after="80"/>
+      </w:pPr>
+      <w:r>
+        <w:rPr>
+          <w:b/>
+          <w:color w:val="1A376C"/>
+          <w:sz w:val="21"/>
+        </w:rPr>
+        <w:t>Manage vehicle status information</w:t>
+      </w:r>
+    </w:p>
+    <w:p>
+      <w:pPr>
+        <w:pStyle w:val="Heading2"/>
+        <w:spacing w:before="200" w:after="80"/>
+      </w:pPr>
+      <w:r>
+        <w:rPr>
+          <w:b/>
+          <w:color w:val="007B83"/>
+          <w:sz w:val="22"/>
+        </w:rPr>
+        <w:t>Tracking Administration</w:t>
+      </w:r>
+    </w:p>
+    <w:p>
+      <w:pPr>
+        <w:pStyle w:val="ListBullet"/>
+        <w:spacing w:after="80"/>
+      </w:pPr>
+      <w:r>
+        <w:rPr>
+          <w:b/>
+          <w:color w:val="1A376C"/>
+          <w:sz w:val="21"/>
+        </w:rPr>
+        <w:t>Vehicle registration management</w:t>
+      </w:r>
+    </w:p>
+    <w:p>
+      <w:pPr>
+        <w:pStyle w:val="ListBullet"/>
+        <w:spacing w:after="80"/>
+      </w:pPr>
+      <w:r>
+        <w:rPr>
+          <w:b/>
+          <w:color w:val="1A376C"/>
+          <w:sz w:val="21"/>
+        </w:rPr>
+        <w:t>Device assignment management</w:t>
+      </w:r>
+    </w:p>
+    <w:p>
+      <w:pPr>
+        <w:pStyle w:val="ListBullet"/>
+        <w:spacing w:after="80"/>
+      </w:pPr>
+      <w:r>
+        <w:rPr>
+          <w:b/>
+          <w:color w:val="1A376C"/>
+          <w:sz w:val="21"/>
+        </w:rPr>
+        <w:t>Tracking configuration controls</w:t>
+      </w:r>
+    </w:p>
+    <w:p>
+      <w:pPr>
+        <w:pStyle w:val="Heading2"/>
+        <w:spacing w:before="200" w:after="80"/>
+      </w:pPr>
+      <w:r>
+        <w:rPr>
+          <w:b/>
+          <w:color w:val="007B83"/>
+          <w:sz w:val="22"/>
+        </w:rPr>
+        <w:t>Deliverables</w:t>
+      </w:r>
+    </w:p>
+    <w:p>
+      <w:pPr>
+        <w:pStyle w:val="ListBullet"/>
+        <w:spacing w:after="80"/>
+      </w:pPr>
+      <w:r>
+        <w:rPr>
+          <w:b/>
+          <w:color w:val="1A376C"/>
+          <w:sz w:val="21"/>
+        </w:rPr>
+        <w:t>Vehicle Management Module</w:t>
+      </w:r>
+    </w:p>
+    <w:p>
+      <w:pPr>
+        <w:pStyle w:val="ListBullet"/>
+        <w:spacing w:after="80"/>
+      </w:pPr>
+      <w:r>
+        <w:rPr>
+          <w:b/>
+          <w:color w:val="1A376C"/>
+          <w:sz w:val="21"/>
+        </w:rPr>
+        <w:t>Shipment-to-Vehicle Assignment Capability</w:t>
+      </w:r>
+    </w:p>
+    <w:p>
+      <w:pPr>
+        <w:pStyle w:val="ListBullet"/>
+        <w:spacing w:after="80"/>
+      </w:pPr>
+      <w:r>
+        <w:rPr>
+          <w:b/>
+          <w:color w:val="1A376C"/>
+          <w:sz w:val="21"/>
+        </w:rPr>
+        <w:t>Tracking Integration Layer</w:t>
+      </w:r>
+    </w:p>
+    <w:p>
+      <w:pPr>
+        <w:pStyle w:val="ListBullet"/>
+        <w:spacing w:after="80"/>
+      </w:pPr>
+      <w:r>
+        <w:rPr>
+          <w:b/>
+          <w:color w:val="1A376C"/>
+          <w:sz w:val="21"/>
+        </w:rPr>
+        <w:t>Tracking Administration Interface</w:t>
+      </w:r>
+    </w:p>
+    <w:p>
+      <w:pPr>
+        <w:pStyle w:val="Heading2"/>
+        <w:spacing w:before="200" w:after="80"/>
+      </w:pPr>
+      <w:r>
+        <w:rPr>
+          <w:b/>
+          <w:color w:val="007B83"/>
+          <w:sz w:val="22"/>
+        </w:rPr>
+        <w:t>Business Benefits</w:t>
+      </w:r>
+    </w:p>
+    <w:p>
+      <w:pPr>
+        <w:pStyle w:val="ListBullet"/>
+        <w:spacing w:after="80"/>
+      </w:pPr>
+      <w:r>
+        <w:rPr>
+          <w:b/>
+          <w:color w:val="1A376C"/>
+          <w:sz w:val="21"/>
+        </w:rPr>
+        <w:t>Foundation for all future tracking capabilities</w:t>
+      </w:r>
+    </w:p>
+    <w:p>
+      <w:pPr>
+        <w:pStyle w:val="ListBullet"/>
+        <w:spacing w:after="80"/>
+      </w:pPr>
+      <w:r>
+        <w:rPr>
+          <w:b/>
+          <w:color w:val="1A376C"/>
+          <w:sz w:val="21"/>
+        </w:rPr>
+        <w:t>Improved operational visibility</w:t>
+      </w:r>
+    </w:p>
+    <w:p>
+      <w:pPr>
+        <w:pStyle w:val="ListBullet"/>
+        <w:spacing w:after="80"/>
+      </w:pPr>
+      <w:r>
+        <w:rPr>
+          <w:b/>
+          <w:color w:val="1A376C"/>
+          <w:sz w:val="21"/>
+        </w:rPr>
+        <w:t>Accurate shipment monitoring</w:t>
       </w:r>
     </w:p>
     <w:p>
@@ -339,7 +679,21 @@
           <w:color w:val="FFFFFF"/>
           <w:sz w:val="26"/>
         </w:rPr>
-        <w:t xml:space="preserve">  2.  Roadmap at a Glance</w:t>
+        <w:t xml:space="preserve">  3.  Phase 2: Real-Time Shipment Tracking</w:t>
+      </w:r>
+    </w:p>
+    <w:p>
+      <w:pPr>
+        <w:pStyle w:val="Heading2"/>
+        <w:spacing w:before="200" w:after="80"/>
+      </w:pPr>
+      <w:r>
+        <w:rPr>
+          <w:b/>
+          <w:color w:val="007B83"/>
+          <w:sz w:val="22"/>
+        </w:rPr>
+        <w:t>Objective</w:t>
       </w:r>
     </w:p>
     <w:p>
@@ -351,7 +705,2337 @@
           <w:color w:val="404040"/>
           <w:sz w:val="21"/>
         </w:rPr>
-        <w:t>Delivery is staged to prioritize the tracking foundation and live visibility before expanding into automation, alerts, and analytics.</w:t>
+        <w:t>Provide live shipment visibility to shippers, carriers, and administrators.</w:t>
+      </w:r>
+    </w:p>
+    <w:p>
+      <w:pPr>
+        <w:pStyle w:val="Heading2"/>
+        <w:spacing w:before="200" w:after="80"/>
+      </w:pPr>
+      <w:r>
+        <w:rPr>
+          <w:b/>
+          <w:color w:val="007B83"/>
+          <w:sz w:val="22"/>
+        </w:rPr>
+        <w:t>Scope</w:t>
+      </w:r>
+    </w:p>
+    <w:p>
+      <w:pPr>
+        <w:pStyle w:val="Heading2"/>
+        <w:spacing w:before="200" w:after="80"/>
+      </w:pPr>
+      <w:r>
+        <w:rPr>
+          <w:b/>
+          <w:color w:val="007B83"/>
+          <w:sz w:val="22"/>
+        </w:rPr>
+        <w:t>Live Vehicle Location</w:t>
+      </w:r>
+    </w:p>
+    <w:p>
+      <w:pPr>
+        <w:pStyle w:val="ListBullet"/>
+        <w:spacing w:after="80"/>
+      </w:pPr>
+      <w:r>
+        <w:rPr>
+          <w:b/>
+          <w:color w:val="1A376C"/>
+          <w:sz w:val="21"/>
+        </w:rPr>
+        <w:t>Current vehicle location display</w:t>
+      </w:r>
+    </w:p>
+    <w:p>
+      <w:pPr>
+        <w:pStyle w:val="ListBullet"/>
+        <w:spacing w:after="80"/>
+      </w:pPr>
+      <w:r>
+        <w:rPr>
+          <w:b/>
+          <w:color w:val="1A376C"/>
+          <w:sz w:val="21"/>
+        </w:rPr>
+        <w:t>Vehicle movement monitoring</w:t>
+      </w:r>
+    </w:p>
+    <w:p>
+      <w:pPr>
+        <w:pStyle w:val="ListBullet"/>
+        <w:spacing w:after="80"/>
+      </w:pPr>
+      <w:r>
+        <w:rPr>
+          <w:b/>
+          <w:color w:val="1A376C"/>
+          <w:sz w:val="21"/>
+        </w:rPr>
+        <w:t>Last update timestamp visibility</w:t>
+      </w:r>
+    </w:p>
+    <w:p>
+      <w:pPr>
+        <w:pStyle w:val="Heading2"/>
+        <w:spacing w:before="200" w:after="80"/>
+      </w:pPr>
+      <w:r>
+        <w:rPr>
+          <w:b/>
+          <w:color w:val="007B83"/>
+          <w:sz w:val="22"/>
+        </w:rPr>
+        <w:t>Shipment Tracking Dashboard</w:t>
+      </w:r>
+    </w:p>
+    <w:p>
+      <w:pPr>
+        <w:pStyle w:val="ListBullet"/>
+        <w:spacing w:after="80"/>
+      </w:pPr>
+      <w:r>
+        <w:rPr>
+          <w:b/>
+          <w:color w:val="1A376C"/>
+          <w:sz w:val="21"/>
+        </w:rPr>
+        <w:t>Real-time shipment map</w:t>
+      </w:r>
+    </w:p>
+    <w:p>
+      <w:pPr>
+        <w:pStyle w:val="ListBullet"/>
+        <w:spacing w:after="80"/>
+      </w:pPr>
+      <w:r>
+        <w:rPr>
+          <w:b/>
+          <w:color w:val="1A376C"/>
+          <w:sz w:val="21"/>
+        </w:rPr>
+        <w:t>Active shipment monitoring</w:t>
+      </w:r>
+    </w:p>
+    <w:p>
+      <w:pPr>
+        <w:pStyle w:val="ListBullet"/>
+        <w:spacing w:after="80"/>
+      </w:pPr>
+      <w:r>
+        <w:rPr>
+          <w:b/>
+          <w:color w:val="1A376C"/>
+          <w:sz w:val="21"/>
+        </w:rPr>
+        <w:t>Shipment progress visualization</w:t>
+      </w:r>
+    </w:p>
+    <w:p>
+      <w:pPr>
+        <w:pStyle w:val="Heading2"/>
+        <w:spacing w:before="200" w:after="80"/>
+      </w:pPr>
+      <w:r>
+        <w:rPr>
+          <w:b/>
+          <w:color w:val="007B83"/>
+          <w:sz w:val="22"/>
+        </w:rPr>
+        <w:t>Shipment Tracking Page</w:t>
+      </w:r>
+    </w:p>
+    <w:p>
+      <w:pPr>
+        <w:spacing w:after="120"/>
+      </w:pPr>
+      <w:r>
+        <w:rPr>
+          <w:color w:val="404040"/>
+          <w:sz w:val="21"/>
+        </w:rPr>
+        <w:t>Display:</w:t>
+      </w:r>
+    </w:p>
+    <w:p>
+      <w:pPr>
+        <w:pStyle w:val="ListBullet"/>
+        <w:spacing w:after="80"/>
+      </w:pPr>
+      <w:r>
+        <w:rPr>
+          <w:b/>
+          <w:color w:val="1A376C"/>
+          <w:sz w:val="21"/>
+        </w:rPr>
+        <w:t>Shipment information</w:t>
+      </w:r>
+    </w:p>
+    <w:p>
+      <w:pPr>
+        <w:pStyle w:val="ListBullet"/>
+        <w:spacing w:after="80"/>
+      </w:pPr>
+      <w:r>
+        <w:rPr>
+          <w:b/>
+          <w:color w:val="1A376C"/>
+          <w:sz w:val="21"/>
+        </w:rPr>
+        <w:t>Assigned carrier</w:t>
+      </w:r>
+    </w:p>
+    <w:p>
+      <w:pPr>
+        <w:pStyle w:val="ListBullet"/>
+        <w:spacing w:after="80"/>
+      </w:pPr>
+      <w:r>
+        <w:rPr>
+          <w:b/>
+          <w:color w:val="1A376C"/>
+          <w:sz w:val="21"/>
+        </w:rPr>
+        <w:t>Assigned vehicle</w:t>
+      </w:r>
+    </w:p>
+    <w:p>
+      <w:pPr>
+        <w:pStyle w:val="ListBullet"/>
+        <w:spacing w:after="80"/>
+      </w:pPr>
+      <w:r>
+        <w:rPr>
+          <w:b/>
+          <w:color w:val="1A376C"/>
+          <w:sz w:val="21"/>
+        </w:rPr>
+        <w:t>Current location</w:t>
+      </w:r>
+    </w:p>
+    <w:p>
+      <w:pPr>
+        <w:pStyle w:val="ListBullet"/>
+        <w:spacing w:after="80"/>
+      </w:pPr>
+      <w:r>
+        <w:rPr>
+          <w:b/>
+          <w:color w:val="1A376C"/>
+          <w:sz w:val="21"/>
+        </w:rPr>
+        <w:t>Current shipment status</w:t>
+      </w:r>
+    </w:p>
+    <w:p>
+      <w:pPr>
+        <w:pStyle w:val="ListBullet"/>
+        <w:spacing w:after="80"/>
+      </w:pPr>
+      <w:r>
+        <w:rPr>
+          <w:b/>
+          <w:color w:val="1A376C"/>
+          <w:sz w:val="21"/>
+        </w:rPr>
+        <w:t>Last reported activity</w:t>
+      </w:r>
+    </w:p>
+    <w:p>
+      <w:pPr>
+        <w:pStyle w:val="Heading2"/>
+        <w:spacing w:before="200" w:after="80"/>
+      </w:pPr>
+      <w:r>
+        <w:rPr>
+          <w:b/>
+          <w:color w:val="007B83"/>
+          <w:sz w:val="22"/>
+        </w:rPr>
+        <w:t>Tracking History</w:t>
+      </w:r>
+    </w:p>
+    <w:p>
+      <w:pPr>
+        <w:pStyle w:val="ListBullet"/>
+        <w:spacing w:after="80"/>
+      </w:pPr>
+      <w:r>
+        <w:rPr>
+          <w:b/>
+          <w:color w:val="1A376C"/>
+          <w:sz w:val="21"/>
+        </w:rPr>
+        <w:t>Historical location records</w:t>
+      </w:r>
+    </w:p>
+    <w:p>
+      <w:pPr>
+        <w:pStyle w:val="ListBullet"/>
+        <w:spacing w:after="80"/>
+      </w:pPr>
+      <w:r>
+        <w:rPr>
+          <w:b/>
+          <w:color w:val="1A376C"/>
+          <w:sz w:val="21"/>
+        </w:rPr>
+        <w:t>Movement timeline</w:t>
+      </w:r>
+    </w:p>
+    <w:p>
+      <w:pPr>
+        <w:pStyle w:val="ListBullet"/>
+        <w:spacing w:after="80"/>
+      </w:pPr>
+      <w:r>
+        <w:rPr>
+          <w:b/>
+          <w:color w:val="1A376C"/>
+          <w:sz w:val="21"/>
+        </w:rPr>
+        <w:t>Position history retrieval</w:t>
+      </w:r>
+    </w:p>
+    <w:p>
+      <w:pPr>
+        <w:pStyle w:val="Heading2"/>
+        <w:spacing w:before="200" w:after="80"/>
+      </w:pPr>
+      <w:r>
+        <w:rPr>
+          <w:b/>
+          <w:color w:val="007B83"/>
+          <w:sz w:val="22"/>
+        </w:rPr>
+        <w:t>Deliverables</w:t>
+      </w:r>
+    </w:p>
+    <w:p>
+      <w:pPr>
+        <w:pStyle w:val="ListBullet"/>
+        <w:spacing w:after="80"/>
+      </w:pPr>
+      <w:r>
+        <w:rPr>
+          <w:b/>
+          <w:color w:val="1A376C"/>
+          <w:sz w:val="21"/>
+        </w:rPr>
+        <w:t>Live Tracking Dashboard</w:t>
+      </w:r>
+    </w:p>
+    <w:p>
+      <w:pPr>
+        <w:pStyle w:val="ListBullet"/>
+        <w:spacing w:after="80"/>
+      </w:pPr>
+      <w:r>
+        <w:rPr>
+          <w:b/>
+          <w:color w:val="1A376C"/>
+          <w:sz w:val="21"/>
+        </w:rPr>
+        <w:t>Shipment Tracking Interface</w:t>
+      </w:r>
+    </w:p>
+    <w:p>
+      <w:pPr>
+        <w:pStyle w:val="ListBullet"/>
+        <w:spacing w:after="80"/>
+      </w:pPr>
+      <w:r>
+        <w:rPr>
+          <w:b/>
+          <w:color w:val="1A376C"/>
+          <w:sz w:val="21"/>
+        </w:rPr>
+        <w:t>Historical Tracking Records</w:t>
+      </w:r>
+    </w:p>
+    <w:p>
+      <w:pPr>
+        <w:pStyle w:val="Heading2"/>
+        <w:spacing w:before="200" w:after="80"/>
+      </w:pPr>
+      <w:r>
+        <w:rPr>
+          <w:b/>
+          <w:color w:val="007B83"/>
+          <w:sz w:val="22"/>
+        </w:rPr>
+        <w:t>Business Benefits</w:t>
+      </w:r>
+    </w:p>
+    <w:p>
+      <w:pPr>
+        <w:pStyle w:val="ListBullet"/>
+        <w:spacing w:after="80"/>
+      </w:pPr>
+      <w:r>
+        <w:rPr>
+          <w:b/>
+          <w:color w:val="1A376C"/>
+          <w:sz w:val="21"/>
+        </w:rPr>
+        <w:t>Increased customer confidence</w:t>
+      </w:r>
+    </w:p>
+    <w:p>
+      <w:pPr>
+        <w:pStyle w:val="ListBullet"/>
+        <w:spacing w:after="80"/>
+      </w:pPr>
+      <w:r>
+        <w:rPr>
+          <w:b/>
+          <w:color w:val="1A376C"/>
+          <w:sz w:val="21"/>
+        </w:rPr>
+        <w:t>Reduced status inquiry calls</w:t>
+      </w:r>
+    </w:p>
+    <w:p>
+      <w:pPr>
+        <w:pStyle w:val="ListBullet"/>
+        <w:spacing w:after="80"/>
+      </w:pPr>
+      <w:r>
+        <w:rPr>
+          <w:b/>
+          <w:color w:val="1A376C"/>
+          <w:sz w:val="21"/>
+        </w:rPr>
+        <w:t>Improved shipment visibility</w:t>
+      </w:r>
+    </w:p>
+    <w:p>
+      <w:pPr>
+        <w:pStyle w:val="ListBullet"/>
+        <w:spacing w:after="80"/>
+      </w:pPr>
+      <w:r>
+        <w:rPr>
+          <w:b/>
+          <w:color w:val="1A376C"/>
+          <w:sz w:val="21"/>
+        </w:rPr>
+        <w:t>Enhanced operational control</w:t>
+      </w:r>
+    </w:p>
+    <w:p>
+      <w:pPr>
+        <w:pStyle w:val="Heading1"/>
+        <w:spacing w:before="280" w:after="120"/>
+        <w:shd w:val="clear" w:color="auto" w:fill="1A376C"/>
+      </w:pPr>
+      <w:r>
+        <w:rPr>
+          <w:b/>
+          <w:color w:val="FFFFFF"/>
+          <w:sz w:val="26"/>
+        </w:rPr>
+        <w:t xml:space="preserve">  4.  Phase 3: Route History &amp; Playback</w:t>
+      </w:r>
+    </w:p>
+    <w:p>
+      <w:pPr>
+        <w:pStyle w:val="Heading2"/>
+        <w:spacing w:before="200" w:after="80"/>
+      </w:pPr>
+      <w:r>
+        <w:rPr>
+          <w:b/>
+          <w:color w:val="007B83"/>
+          <w:sz w:val="22"/>
+        </w:rPr>
+        <w:t>Objective</w:t>
+      </w:r>
+    </w:p>
+    <w:p>
+      <w:pPr>
+        <w:spacing w:after="120"/>
+      </w:pPr>
+      <w:r>
+        <w:rPr>
+          <w:color w:val="404040"/>
+          <w:sz w:val="21"/>
+        </w:rPr>
+        <w:t>Allow users and administrators to review completed and active shipment journeys.</w:t>
+      </w:r>
+    </w:p>
+    <w:p>
+      <w:pPr>
+        <w:pStyle w:val="Heading2"/>
+        <w:spacing w:before="200" w:after="80"/>
+      </w:pPr>
+      <w:r>
+        <w:rPr>
+          <w:b/>
+          <w:color w:val="007B83"/>
+          <w:sz w:val="22"/>
+        </w:rPr>
+        <w:t>Scope</w:t>
+      </w:r>
+    </w:p>
+    <w:p>
+      <w:pPr>
+        <w:pStyle w:val="Heading2"/>
+        <w:spacing w:before="200" w:after="80"/>
+      </w:pPr>
+      <w:r>
+        <w:rPr>
+          <w:b/>
+          <w:color w:val="007B83"/>
+          <w:sz w:val="22"/>
+        </w:rPr>
+        <w:t>Route Playback</w:t>
+      </w:r>
+    </w:p>
+    <w:p>
+      <w:pPr>
+        <w:pStyle w:val="ListBullet"/>
+        <w:spacing w:after="80"/>
+      </w:pPr>
+      <w:r>
+        <w:rPr>
+          <w:b/>
+          <w:color w:val="1A376C"/>
+          <w:sz w:val="21"/>
+        </w:rPr>
+        <w:t>Historical route visualization</w:t>
+      </w:r>
+    </w:p>
+    <w:p>
+      <w:pPr>
+        <w:pStyle w:val="ListBullet"/>
+        <w:spacing w:after="80"/>
+      </w:pPr>
+      <w:r>
+        <w:rPr>
+          <w:b/>
+          <w:color w:val="1A376C"/>
+          <w:sz w:val="21"/>
+        </w:rPr>
+        <w:t>Journey replay functionality</w:t>
+      </w:r>
+    </w:p>
+    <w:p>
+      <w:pPr>
+        <w:pStyle w:val="ListBullet"/>
+        <w:spacing w:after="80"/>
+      </w:pPr>
+      <w:r>
+        <w:rPr>
+          <w:b/>
+          <w:color w:val="1A376C"/>
+          <w:sz w:val="21"/>
+        </w:rPr>
+        <w:t>Time-based movement review</w:t>
+      </w:r>
+    </w:p>
+    <w:p>
+      <w:pPr>
+        <w:pStyle w:val="Heading2"/>
+        <w:spacing w:before="200" w:after="80"/>
+      </w:pPr>
+      <w:r>
+        <w:rPr>
+          <w:b/>
+          <w:color w:val="007B83"/>
+          <w:sz w:val="22"/>
+        </w:rPr>
+        <w:t>Trip Analysis</w:t>
+      </w:r>
+    </w:p>
+    <w:p>
+      <w:pPr>
+        <w:pStyle w:val="ListBullet"/>
+        <w:spacing w:after="80"/>
+      </w:pPr>
+      <w:r>
+        <w:rPr>
+          <w:b/>
+          <w:color w:val="1A376C"/>
+          <w:sz w:val="21"/>
+        </w:rPr>
+        <w:t>Route traveled</w:t>
+      </w:r>
+    </w:p>
+    <w:p>
+      <w:pPr>
+        <w:pStyle w:val="ListBullet"/>
+        <w:spacing w:after="80"/>
+      </w:pPr>
+      <w:r>
+        <w:rPr>
+          <w:b/>
+          <w:color w:val="1A376C"/>
+          <w:sz w:val="21"/>
+        </w:rPr>
+        <w:t>Distance covered</w:t>
+      </w:r>
+    </w:p>
+    <w:p>
+      <w:pPr>
+        <w:pStyle w:val="ListBullet"/>
+        <w:spacing w:after="80"/>
+      </w:pPr>
+      <w:r>
+        <w:rPr>
+          <w:b/>
+          <w:color w:val="1A376C"/>
+          <w:sz w:val="21"/>
+        </w:rPr>
+        <w:t>Stop duration analysis</w:t>
+      </w:r>
+    </w:p>
+    <w:p>
+      <w:pPr>
+        <w:pStyle w:val="ListBullet"/>
+        <w:spacing w:after="80"/>
+      </w:pPr>
+      <w:r>
+        <w:rPr>
+          <w:b/>
+          <w:color w:val="1A376C"/>
+          <w:sz w:val="21"/>
+        </w:rPr>
+        <w:t>Travel activity history</w:t>
+      </w:r>
+    </w:p>
+    <w:p>
+      <w:pPr>
+        <w:pStyle w:val="Heading2"/>
+        <w:spacing w:before="200" w:after="80"/>
+      </w:pPr>
+      <w:r>
+        <w:rPr>
+          <w:b/>
+          <w:color w:val="007B83"/>
+          <w:sz w:val="22"/>
+        </w:rPr>
+        <w:t>Operational Investigation</w:t>
+      </w:r>
+    </w:p>
+    <w:p>
+      <w:pPr>
+        <w:pStyle w:val="ListBullet"/>
+        <w:spacing w:after="80"/>
+      </w:pPr>
+      <w:r>
+        <w:rPr>
+          <w:b/>
+          <w:color w:val="1A376C"/>
+          <w:sz w:val="21"/>
+        </w:rPr>
+        <w:t>Shipment verification</w:t>
+      </w:r>
+    </w:p>
+    <w:p>
+      <w:pPr>
+        <w:pStyle w:val="ListBullet"/>
+        <w:spacing w:after="80"/>
+      </w:pPr>
+      <w:r>
+        <w:rPr>
+          <w:b/>
+          <w:color w:val="1A376C"/>
+          <w:sz w:val="21"/>
+        </w:rPr>
+        <w:t>Route compliance monitoring</w:t>
+      </w:r>
+    </w:p>
+    <w:p>
+      <w:pPr>
+        <w:pStyle w:val="ListBullet"/>
+        <w:spacing w:after="80"/>
+      </w:pPr>
+      <w:r>
+        <w:rPr>
+          <w:b/>
+          <w:color w:val="1A376C"/>
+          <w:sz w:val="21"/>
+        </w:rPr>
+        <w:t>Delivery confirmation support</w:t>
+      </w:r>
+    </w:p>
+    <w:p>
+      <w:pPr>
+        <w:pStyle w:val="Heading2"/>
+        <w:spacing w:before="200" w:after="80"/>
+      </w:pPr>
+      <w:r>
+        <w:rPr>
+          <w:b/>
+          <w:color w:val="007B83"/>
+          <w:sz w:val="22"/>
+        </w:rPr>
+        <w:t>Deliverables</w:t>
+      </w:r>
+    </w:p>
+    <w:p>
+      <w:pPr>
+        <w:pStyle w:val="ListBullet"/>
+        <w:spacing w:after="80"/>
+      </w:pPr>
+      <w:r>
+        <w:rPr>
+          <w:b/>
+          <w:color w:val="1A376C"/>
+          <w:sz w:val="21"/>
+        </w:rPr>
+        <w:t>Route Playback Interface</w:t>
+      </w:r>
+    </w:p>
+    <w:p>
+      <w:pPr>
+        <w:pStyle w:val="ListBullet"/>
+        <w:spacing w:after="80"/>
+      </w:pPr>
+      <w:r>
+        <w:rPr>
+          <w:b/>
+          <w:color w:val="1A376C"/>
+          <w:sz w:val="21"/>
+        </w:rPr>
+        <w:t>Journey History Reports</w:t>
+      </w:r>
+    </w:p>
+    <w:p>
+      <w:pPr>
+        <w:pStyle w:val="ListBullet"/>
+        <w:spacing w:after="80"/>
+      </w:pPr>
+      <w:r>
+        <w:rPr>
+          <w:b/>
+          <w:color w:val="1A376C"/>
+          <w:sz w:val="21"/>
+        </w:rPr>
+        <w:t>Route Analysis Tools</w:t>
+      </w:r>
+    </w:p>
+    <w:p>
+      <w:pPr>
+        <w:pStyle w:val="Heading2"/>
+        <w:spacing w:before="200" w:after="80"/>
+      </w:pPr>
+      <w:r>
+        <w:rPr>
+          <w:b/>
+          <w:color w:val="007B83"/>
+          <w:sz w:val="22"/>
+        </w:rPr>
+        <w:t>Business Benefits</w:t>
+      </w:r>
+    </w:p>
+    <w:p>
+      <w:pPr>
+        <w:pStyle w:val="ListBullet"/>
+        <w:spacing w:after="80"/>
+      </w:pPr>
+      <w:r>
+        <w:rPr>
+          <w:b/>
+          <w:color w:val="1A376C"/>
+          <w:sz w:val="21"/>
+        </w:rPr>
+        <w:t>Shipment audit capability</w:t>
+      </w:r>
+    </w:p>
+    <w:p>
+      <w:pPr>
+        <w:pStyle w:val="ListBullet"/>
+        <w:spacing w:after="80"/>
+      </w:pPr>
+      <w:r>
+        <w:rPr>
+          <w:b/>
+          <w:color w:val="1A376C"/>
+          <w:sz w:val="21"/>
+        </w:rPr>
+        <w:t>Improved dispute resolution</w:t>
+      </w:r>
+    </w:p>
+    <w:p>
+      <w:pPr>
+        <w:pStyle w:val="ListBullet"/>
+        <w:spacing w:after="80"/>
+      </w:pPr>
+      <w:r>
+        <w:rPr>
+          <w:b/>
+          <w:color w:val="1A376C"/>
+          <w:sz w:val="21"/>
+        </w:rPr>
+        <w:t>Operational performance insights</w:t>
+      </w:r>
+    </w:p>
+    <w:p>
+      <w:pPr>
+        <w:pStyle w:val="ListBullet"/>
+        <w:spacing w:after="80"/>
+      </w:pPr>
+      <w:r>
+        <w:rPr>
+          <w:b/>
+          <w:color w:val="1A376C"/>
+          <w:sz w:val="21"/>
+        </w:rPr>
+        <w:t>Historical shipment verification</w:t>
+      </w:r>
+    </w:p>
+    <w:p>
+      <w:pPr>
+        <w:pStyle w:val="Heading1"/>
+        <w:spacing w:before="280" w:after="120"/>
+        <w:shd w:val="clear" w:color="auto" w:fill="1A376C"/>
+      </w:pPr>
+      <w:r>
+        <w:rPr>
+          <w:b/>
+          <w:color w:val="FFFFFF"/>
+          <w:sz w:val="26"/>
+        </w:rPr>
+        <w:t xml:space="preserve">  5.  Phase 4: Geofence-Based Logistics Automation</w:t>
+      </w:r>
+    </w:p>
+    <w:p>
+      <w:pPr>
+        <w:pStyle w:val="Heading2"/>
+        <w:spacing w:before="200" w:after="80"/>
+      </w:pPr>
+      <w:r>
+        <w:rPr>
+          <w:b/>
+          <w:color w:val="007B83"/>
+          <w:sz w:val="22"/>
+        </w:rPr>
+        <w:t>Objective</w:t>
+      </w:r>
+    </w:p>
+    <w:p>
+      <w:pPr>
+        <w:spacing w:after="120"/>
+      </w:pPr>
+      <w:r>
+        <w:rPr>
+          <w:color w:val="404040"/>
+          <w:sz w:val="21"/>
+        </w:rPr>
+        <w:t>Automate shipment monitoring using location-based events.</w:t>
+      </w:r>
+    </w:p>
+    <w:p>
+      <w:pPr>
+        <w:pStyle w:val="Heading2"/>
+        <w:spacing w:before="200" w:after="80"/>
+      </w:pPr>
+      <w:r>
+        <w:rPr>
+          <w:b/>
+          <w:color w:val="007B83"/>
+          <w:sz w:val="22"/>
+        </w:rPr>
+        <w:t>Scope</w:t>
+      </w:r>
+    </w:p>
+    <w:p>
+      <w:pPr>
+        <w:pStyle w:val="Heading2"/>
+        <w:spacing w:before="200" w:after="80"/>
+      </w:pPr>
+      <w:r>
+        <w:rPr>
+          <w:b/>
+          <w:color w:val="007B83"/>
+          <w:sz w:val="22"/>
+        </w:rPr>
+        <w:t>Pickup Geofences</w:t>
+      </w:r>
+    </w:p>
+    <w:p>
+      <w:pPr>
+        <w:pStyle w:val="ListBullet"/>
+        <w:spacing w:after="80"/>
+      </w:pPr>
+      <w:r>
+        <w:rPr>
+          <w:b/>
+          <w:color w:val="1A376C"/>
+          <w:sz w:val="21"/>
+        </w:rPr>
+        <w:t>Pickup area definition</w:t>
+      </w:r>
+    </w:p>
+    <w:p>
+      <w:pPr>
+        <w:pStyle w:val="ListBullet"/>
+        <w:spacing w:after="80"/>
+      </w:pPr>
+      <w:r>
+        <w:rPr>
+          <w:b/>
+          <w:color w:val="1A376C"/>
+          <w:sz w:val="21"/>
+        </w:rPr>
+        <w:t>Arrival detection</w:t>
+      </w:r>
+    </w:p>
+    <w:p>
+      <w:pPr>
+        <w:pStyle w:val="ListBullet"/>
+        <w:spacing w:after="80"/>
+      </w:pPr>
+      <w:r>
+        <w:rPr>
+          <w:b/>
+          <w:color w:val="1A376C"/>
+          <w:sz w:val="21"/>
+        </w:rPr>
+        <w:t>Departure detection</w:t>
+      </w:r>
+    </w:p>
+    <w:p>
+      <w:pPr>
+        <w:pStyle w:val="Heading2"/>
+        <w:spacing w:before="200" w:after="80"/>
+      </w:pPr>
+      <w:r>
+        <w:rPr>
+          <w:b/>
+          <w:color w:val="007B83"/>
+          <w:sz w:val="22"/>
+        </w:rPr>
+        <w:t>Destination Geofences</w:t>
+      </w:r>
+    </w:p>
+    <w:p>
+      <w:pPr>
+        <w:pStyle w:val="ListBullet"/>
+        <w:spacing w:after="80"/>
+      </w:pPr>
+      <w:r>
+        <w:rPr>
+          <w:b/>
+          <w:color w:val="1A376C"/>
+          <w:sz w:val="21"/>
+        </w:rPr>
+        <w:t>Delivery area definition</w:t>
+      </w:r>
+    </w:p>
+    <w:p>
+      <w:pPr>
+        <w:pStyle w:val="ListBullet"/>
+        <w:spacing w:after="80"/>
+      </w:pPr>
+      <w:r>
+        <w:rPr>
+          <w:b/>
+          <w:color w:val="1A376C"/>
+          <w:sz w:val="21"/>
+        </w:rPr>
+        <w:t>Destination arrival detection</w:t>
+      </w:r>
+    </w:p>
+    <w:p>
+      <w:pPr>
+        <w:pStyle w:val="ListBullet"/>
+        <w:spacing w:after="80"/>
+      </w:pPr>
+      <w:r>
+        <w:rPr>
+          <w:b/>
+          <w:color w:val="1A376C"/>
+          <w:sz w:val="21"/>
+        </w:rPr>
+        <w:t>Delivery verification support</w:t>
+      </w:r>
+    </w:p>
+    <w:p>
+      <w:pPr>
+        <w:pStyle w:val="Heading2"/>
+        <w:spacing w:before="200" w:after="80"/>
+      </w:pPr>
+      <w:r>
+        <w:rPr>
+          <w:b/>
+          <w:color w:val="007B83"/>
+          <w:sz w:val="22"/>
+        </w:rPr>
+        <w:t>Event Monitoring</w:t>
+      </w:r>
+    </w:p>
+    <w:p>
+      <w:pPr>
+        <w:pStyle w:val="ListBullet"/>
+        <w:spacing w:after="80"/>
+      </w:pPr>
+      <w:r>
+        <w:rPr>
+          <w:b/>
+          <w:color w:val="1A376C"/>
+          <w:sz w:val="21"/>
+        </w:rPr>
+        <w:t>Entry events</w:t>
+      </w:r>
+    </w:p>
+    <w:p>
+      <w:pPr>
+        <w:pStyle w:val="ListBullet"/>
+        <w:spacing w:after="80"/>
+      </w:pPr>
+      <w:r>
+        <w:rPr>
+          <w:b/>
+          <w:color w:val="1A376C"/>
+          <w:sz w:val="21"/>
+        </w:rPr>
+        <w:t>Exit events</w:t>
+      </w:r>
+    </w:p>
+    <w:p>
+      <w:pPr>
+        <w:pStyle w:val="ListBullet"/>
+        <w:spacing w:after="80"/>
+      </w:pPr>
+      <w:r>
+        <w:rPr>
+          <w:b/>
+          <w:color w:val="1A376C"/>
+          <w:sz w:val="21"/>
+        </w:rPr>
+        <w:t>Arrival notifications</w:t>
+      </w:r>
+    </w:p>
+    <w:p>
+      <w:pPr>
+        <w:pStyle w:val="Heading2"/>
+        <w:spacing w:before="200" w:after="80"/>
+      </w:pPr>
+      <w:r>
+        <w:rPr>
+          <w:b/>
+          <w:color w:val="007B83"/>
+          <w:sz w:val="22"/>
+        </w:rPr>
+        <w:t>Shipment Event Recording</w:t>
+      </w:r>
+    </w:p>
+    <w:p>
+      <w:pPr>
+        <w:pStyle w:val="ListBullet"/>
+        <w:spacing w:after="80"/>
+      </w:pPr>
+      <w:r>
+        <w:rPr>
+          <w:b/>
+          <w:color w:val="1A376C"/>
+          <w:sz w:val="21"/>
+        </w:rPr>
+        <w:t>Geofence event history</w:t>
+      </w:r>
+    </w:p>
+    <w:p>
+      <w:pPr>
+        <w:pStyle w:val="ListBullet"/>
+        <w:spacing w:after="80"/>
+      </w:pPr>
+      <w:r>
+        <w:rPr>
+          <w:b/>
+          <w:color w:val="1A376C"/>
+          <w:sz w:val="21"/>
+        </w:rPr>
+        <w:t>Automated operational logs</w:t>
+      </w:r>
+    </w:p>
+    <w:p>
+      <w:pPr>
+        <w:pStyle w:val="ListBullet"/>
+        <w:spacing w:after="80"/>
+      </w:pPr>
+      <w:r>
+        <w:rPr>
+          <w:b/>
+          <w:color w:val="1A376C"/>
+          <w:sz w:val="21"/>
+        </w:rPr>
+        <w:t>Location-based audit trail</w:t>
+      </w:r>
+    </w:p>
+    <w:p>
+      <w:pPr>
+        <w:pStyle w:val="Heading2"/>
+        <w:spacing w:before="200" w:after="80"/>
+      </w:pPr>
+      <w:r>
+        <w:rPr>
+          <w:b/>
+          <w:color w:val="007B83"/>
+          <w:sz w:val="22"/>
+        </w:rPr>
+        <w:t>Deliverables</w:t>
+      </w:r>
+    </w:p>
+    <w:p>
+      <w:pPr>
+        <w:pStyle w:val="ListBullet"/>
+        <w:spacing w:after="80"/>
+      </w:pPr>
+      <w:r>
+        <w:rPr>
+          <w:b/>
+          <w:color w:val="1A376C"/>
+          <w:sz w:val="21"/>
+        </w:rPr>
+        <w:t>Geofence Management System</w:t>
+      </w:r>
+    </w:p>
+    <w:p>
+      <w:pPr>
+        <w:pStyle w:val="ListBullet"/>
+        <w:spacing w:after="80"/>
+      </w:pPr>
+      <w:r>
+        <w:rPr>
+          <w:b/>
+          <w:color w:val="1A376C"/>
+          <w:sz w:val="21"/>
+        </w:rPr>
+        <w:t>Geofence Event Processing</w:t>
+      </w:r>
+    </w:p>
+    <w:p>
+      <w:pPr>
+        <w:pStyle w:val="ListBullet"/>
+        <w:spacing w:after="80"/>
+      </w:pPr>
+      <w:r>
+        <w:rPr>
+          <w:b/>
+          <w:color w:val="1A376C"/>
+          <w:sz w:val="21"/>
+        </w:rPr>
+        <w:t>Automated Shipment Event Recording</w:t>
+      </w:r>
+    </w:p>
+    <w:p>
+      <w:pPr>
+        <w:pStyle w:val="Heading2"/>
+        <w:spacing w:before="200" w:after="80"/>
+      </w:pPr>
+      <w:r>
+        <w:rPr>
+          <w:b/>
+          <w:color w:val="007B83"/>
+          <w:sz w:val="22"/>
+        </w:rPr>
+        <w:t>Business Benefits</w:t>
+      </w:r>
+    </w:p>
+    <w:p>
+      <w:pPr>
+        <w:pStyle w:val="ListBullet"/>
+        <w:spacing w:after="80"/>
+      </w:pPr>
+      <w:r>
+        <w:rPr>
+          <w:b/>
+          <w:color w:val="1A376C"/>
+          <w:sz w:val="21"/>
+        </w:rPr>
+        <w:t>Reduced manual monitoring</w:t>
+      </w:r>
+    </w:p>
+    <w:p>
+      <w:pPr>
+        <w:pStyle w:val="ListBullet"/>
+        <w:spacing w:after="80"/>
+      </w:pPr>
+      <w:r>
+        <w:rPr>
+          <w:b/>
+          <w:color w:val="1A376C"/>
+          <w:sz w:val="21"/>
+        </w:rPr>
+        <w:t>Increased operational accuracy</w:t>
+      </w:r>
+    </w:p>
+    <w:p>
+      <w:pPr>
+        <w:pStyle w:val="ListBullet"/>
+        <w:spacing w:after="80"/>
+      </w:pPr>
+      <w:r>
+        <w:rPr>
+          <w:b/>
+          <w:color w:val="1A376C"/>
+          <w:sz w:val="21"/>
+        </w:rPr>
+        <w:t>Improved delivery verification</w:t>
+      </w:r>
+    </w:p>
+    <w:p>
+      <w:pPr>
+        <w:pStyle w:val="ListBullet"/>
+        <w:spacing w:after="80"/>
+      </w:pPr>
+      <w:r>
+        <w:rPr>
+          <w:b/>
+          <w:color w:val="1A376C"/>
+          <w:sz w:val="21"/>
+        </w:rPr>
+        <w:t>Better shipment accountability</w:t>
+      </w:r>
+    </w:p>
+    <w:p>
+      <w:pPr>
+        <w:pStyle w:val="Heading1"/>
+        <w:spacing w:before="280" w:after="120"/>
+        <w:shd w:val="clear" w:color="auto" w:fill="1A376C"/>
+      </w:pPr>
+      <w:r>
+        <w:rPr>
+          <w:b/>
+          <w:color w:val="FFFFFF"/>
+          <w:sz w:val="26"/>
+        </w:rPr>
+        <w:t xml:space="preserve">  6.  Phase 5: Intelligent Shipment Status Automation</w:t>
+      </w:r>
+    </w:p>
+    <w:p>
+      <w:pPr>
+        <w:pStyle w:val="Heading2"/>
+        <w:spacing w:before="200" w:after="80"/>
+      </w:pPr>
+      <w:r>
+        <w:rPr>
+          <w:b/>
+          <w:color w:val="007B83"/>
+          <w:sz w:val="22"/>
+        </w:rPr>
+        <w:t>Objective</w:t>
+      </w:r>
+    </w:p>
+    <w:p>
+      <w:pPr>
+        <w:spacing w:after="120"/>
+      </w:pPr>
+      <w:r>
+        <w:rPr>
+          <w:color w:val="404040"/>
+          <w:sz w:val="21"/>
+        </w:rPr>
+        <w:t>Reduce manual shipment updates and improve status accuracy.</w:t>
+      </w:r>
+    </w:p>
+    <w:p>
+      <w:pPr>
+        <w:pStyle w:val="Heading2"/>
+        <w:spacing w:before="200" w:after="80"/>
+      </w:pPr>
+      <w:r>
+        <w:rPr>
+          <w:b/>
+          <w:color w:val="007B83"/>
+          <w:sz w:val="22"/>
+        </w:rPr>
+        <w:t>Scope</w:t>
+      </w:r>
+    </w:p>
+    <w:p>
+      <w:pPr>
+        <w:pStyle w:val="Heading2"/>
+        <w:spacing w:before="200" w:after="80"/>
+      </w:pPr>
+      <w:r>
+        <w:rPr>
+          <w:b/>
+          <w:color w:val="007B83"/>
+          <w:sz w:val="22"/>
+        </w:rPr>
+        <w:t>Automated Status Progression</w:t>
+      </w:r>
+    </w:p>
+    <w:p>
+      <w:pPr>
+        <w:spacing w:after="120"/>
+      </w:pPr>
+      <w:r>
+        <w:rPr>
+          <w:color w:val="404040"/>
+          <w:sz w:val="21"/>
+        </w:rPr>
+        <w:t>Examples:</w:t>
+      </w:r>
+    </w:p>
+    <w:p>
+      <w:pPr>
+        <w:pStyle w:val="ListBullet"/>
+        <w:spacing w:after="80"/>
+      </w:pPr>
+      <w:r>
+        <w:rPr>
+          <w:b/>
+          <w:color w:val="1A376C"/>
+          <w:sz w:val="21"/>
+        </w:rPr>
+        <w:t>Pickup location reached → Shipment Ready for Pickup</w:t>
+      </w:r>
+    </w:p>
+    <w:p>
+      <w:pPr>
+        <w:pStyle w:val="ListBullet"/>
+        <w:spacing w:after="80"/>
+      </w:pPr>
+      <w:r>
+        <w:rPr>
+          <w:b/>
+          <w:color w:val="1A376C"/>
+          <w:sz w:val="21"/>
+        </w:rPr>
+        <w:t>Pickup completed → In Transit</w:t>
+      </w:r>
+    </w:p>
+    <w:p>
+      <w:pPr>
+        <w:pStyle w:val="ListBullet"/>
+        <w:spacing w:after="80"/>
+      </w:pPr>
+      <w:r>
+        <w:rPr>
+          <w:b/>
+          <w:color w:val="1A376C"/>
+          <w:sz w:val="21"/>
+        </w:rPr>
+        <w:t>Destination reached → Delivered</w:t>
+      </w:r>
+    </w:p>
+    <w:p>
+      <w:pPr>
+        <w:pStyle w:val="Heading2"/>
+        <w:spacing w:before="200" w:after="80"/>
+      </w:pPr>
+      <w:r>
+        <w:rPr>
+          <w:b/>
+          <w:color w:val="007B83"/>
+          <w:sz w:val="22"/>
+        </w:rPr>
+        <w:t>Event-Driven Workflow Management</w:t>
+      </w:r>
+    </w:p>
+    <w:p>
+      <w:pPr>
+        <w:pStyle w:val="ListBullet"/>
+        <w:spacing w:after="80"/>
+      </w:pPr>
+      <w:r>
+        <w:rPr>
+          <w:b/>
+          <w:color w:val="1A376C"/>
+          <w:sz w:val="21"/>
+        </w:rPr>
+        <w:t>Automatic shipment progression</w:t>
+      </w:r>
+    </w:p>
+    <w:p>
+      <w:pPr>
+        <w:pStyle w:val="ListBullet"/>
+        <w:spacing w:after="80"/>
+      </w:pPr>
+      <w:r>
+        <w:rPr>
+          <w:b/>
+          <w:color w:val="1A376C"/>
+          <w:sz w:val="21"/>
+        </w:rPr>
+        <w:t>Reduced user intervention</w:t>
+      </w:r>
+    </w:p>
+    <w:p>
+      <w:pPr>
+        <w:pStyle w:val="ListBullet"/>
+        <w:spacing w:after="80"/>
+      </w:pPr>
+      <w:r>
+        <w:rPr>
+          <w:b/>
+          <w:color w:val="1A376C"/>
+          <w:sz w:val="21"/>
+        </w:rPr>
+        <w:t>Location-based workflow triggers</w:t>
+      </w:r>
+    </w:p>
+    <w:p>
+      <w:pPr>
+        <w:pStyle w:val="Heading2"/>
+        <w:spacing w:before="200" w:after="80"/>
+      </w:pPr>
+      <w:r>
+        <w:rPr>
+          <w:b/>
+          <w:color w:val="007B83"/>
+          <w:sz w:val="22"/>
+        </w:rPr>
+        <w:t>Exception Handling</w:t>
+      </w:r>
+    </w:p>
+    <w:p>
+      <w:pPr>
+        <w:pStyle w:val="ListBullet"/>
+        <w:spacing w:after="80"/>
+      </w:pPr>
+      <w:r>
+        <w:rPr>
+          <w:b/>
+          <w:color w:val="1A376C"/>
+          <w:sz w:val="21"/>
+        </w:rPr>
+        <w:t>Missed route alerts</w:t>
+      </w:r>
+    </w:p>
+    <w:p>
+      <w:pPr>
+        <w:pStyle w:val="ListBullet"/>
+        <w:spacing w:after="80"/>
+      </w:pPr>
+      <w:r>
+        <w:rPr>
+          <w:b/>
+          <w:color w:val="1A376C"/>
+          <w:sz w:val="21"/>
+        </w:rPr>
+        <w:t>Delayed movement detection</w:t>
+      </w:r>
+    </w:p>
+    <w:p>
+      <w:pPr>
+        <w:pStyle w:val="ListBullet"/>
+        <w:spacing w:after="80"/>
+      </w:pPr>
+      <w:r>
+        <w:rPr>
+          <w:b/>
+          <w:color w:val="1A376C"/>
+          <w:sz w:val="21"/>
+        </w:rPr>
+        <w:t>Unexpected stop detection</w:t>
+      </w:r>
+    </w:p>
+    <w:p>
+      <w:pPr>
+        <w:pStyle w:val="Heading2"/>
+        <w:spacing w:before="200" w:after="80"/>
+      </w:pPr>
+      <w:r>
+        <w:rPr>
+          <w:b/>
+          <w:color w:val="007B83"/>
+          <w:sz w:val="22"/>
+        </w:rPr>
+        <w:t>Deliverables</w:t>
+      </w:r>
+    </w:p>
+    <w:p>
+      <w:pPr>
+        <w:pStyle w:val="ListBullet"/>
+        <w:spacing w:after="80"/>
+      </w:pPr>
+      <w:r>
+        <w:rPr>
+          <w:b/>
+          <w:color w:val="1A376C"/>
+          <w:sz w:val="21"/>
+        </w:rPr>
+        <w:t>Automated Status Engine</w:t>
+      </w:r>
+    </w:p>
+    <w:p>
+      <w:pPr>
+        <w:pStyle w:val="ListBullet"/>
+        <w:spacing w:after="80"/>
+      </w:pPr>
+      <w:r>
+        <w:rPr>
+          <w:b/>
+          <w:color w:val="1A376C"/>
+          <w:sz w:val="21"/>
+        </w:rPr>
+        <w:t>Event Processing Framework</w:t>
+      </w:r>
+    </w:p>
+    <w:p>
+      <w:pPr>
+        <w:pStyle w:val="ListBullet"/>
+        <w:spacing w:after="80"/>
+      </w:pPr>
+      <w:r>
+        <w:rPr>
+          <w:b/>
+          <w:color w:val="1A376C"/>
+          <w:sz w:val="21"/>
+        </w:rPr>
+        <w:t>Shipment Automation Rules</w:t>
+      </w:r>
+    </w:p>
+    <w:p>
+      <w:pPr>
+        <w:pStyle w:val="Heading2"/>
+        <w:spacing w:before="200" w:after="80"/>
+      </w:pPr>
+      <w:r>
+        <w:rPr>
+          <w:b/>
+          <w:color w:val="007B83"/>
+          <w:sz w:val="22"/>
+        </w:rPr>
+        <w:t>Business Benefits</w:t>
+      </w:r>
+    </w:p>
+    <w:p>
+      <w:pPr>
+        <w:pStyle w:val="ListBullet"/>
+        <w:spacing w:after="80"/>
+      </w:pPr>
+      <w:r>
+        <w:rPr>
+          <w:b/>
+          <w:color w:val="1A376C"/>
+          <w:sz w:val="21"/>
+        </w:rPr>
+        <w:t>Reduced operational workload</w:t>
+      </w:r>
+    </w:p>
+    <w:p>
+      <w:pPr>
+        <w:pStyle w:val="ListBullet"/>
+        <w:spacing w:after="80"/>
+      </w:pPr>
+      <w:r>
+        <w:rPr>
+          <w:b/>
+          <w:color w:val="1A376C"/>
+          <w:sz w:val="21"/>
+        </w:rPr>
+        <w:t>Improved shipment data accuracy</w:t>
+      </w:r>
+    </w:p>
+    <w:p>
+      <w:pPr>
+        <w:pStyle w:val="ListBullet"/>
+        <w:spacing w:after="80"/>
+      </w:pPr>
+      <w:r>
+        <w:rPr>
+          <w:b/>
+          <w:color w:val="1A376C"/>
+          <w:sz w:val="21"/>
+        </w:rPr>
+        <w:t>Faster status updates</w:t>
+      </w:r>
+    </w:p>
+    <w:p>
+      <w:pPr>
+        <w:pStyle w:val="ListBullet"/>
+        <w:spacing w:after="80"/>
+      </w:pPr>
+      <w:r>
+        <w:rPr>
+          <w:b/>
+          <w:color w:val="1A376C"/>
+          <w:sz w:val="21"/>
+        </w:rPr>
+        <w:t>Improved customer experience</w:t>
+      </w:r>
+    </w:p>
+    <w:p>
+      <w:pPr>
+        <w:pStyle w:val="Heading1"/>
+        <w:spacing w:before="280" w:after="120"/>
+        <w:shd w:val="clear" w:color="auto" w:fill="1A376C"/>
+      </w:pPr>
+      <w:r>
+        <w:rPr>
+          <w:b/>
+          <w:color w:val="FFFFFF"/>
+          <w:sz w:val="26"/>
+        </w:rPr>
+        <w:t xml:space="preserve">  7.  Phase 6: Notifications &amp; Tracking Alerts</w:t>
+      </w:r>
+    </w:p>
+    <w:p>
+      <w:pPr>
+        <w:pStyle w:val="Heading2"/>
+        <w:spacing w:before="200" w:after="80"/>
+      </w:pPr>
+      <w:r>
+        <w:rPr>
+          <w:b/>
+          <w:color w:val="007B83"/>
+          <w:sz w:val="22"/>
+        </w:rPr>
+        <w:t>Objective</w:t>
+      </w:r>
+    </w:p>
+    <w:p>
+      <w:pPr>
+        <w:spacing w:after="120"/>
+      </w:pPr>
+      <w:r>
+        <w:rPr>
+          <w:color w:val="404040"/>
+          <w:sz w:val="21"/>
+        </w:rPr>
+        <w:t>Keep all stakeholders informed about shipment progress.</w:t>
+      </w:r>
+    </w:p>
+    <w:p>
+      <w:pPr>
+        <w:pStyle w:val="Heading2"/>
+        <w:spacing w:before="200" w:after="80"/>
+      </w:pPr>
+      <w:r>
+        <w:rPr>
+          <w:b/>
+          <w:color w:val="007B83"/>
+          <w:sz w:val="22"/>
+        </w:rPr>
+        <w:t>Scope</w:t>
+      </w:r>
+    </w:p>
+    <w:p>
+      <w:pPr>
+        <w:pStyle w:val="Heading2"/>
+        <w:spacing w:before="200" w:after="80"/>
+      </w:pPr>
+      <w:r>
+        <w:rPr>
+          <w:b/>
+          <w:color w:val="007B83"/>
+          <w:sz w:val="22"/>
+        </w:rPr>
+        <w:t>Shipment Notifications</w:t>
+      </w:r>
+    </w:p>
+    <w:p>
+      <w:pPr>
+        <w:pStyle w:val="ListBullet"/>
+        <w:spacing w:after="80"/>
+      </w:pPr>
+      <w:r>
+        <w:rPr>
+          <w:b/>
+          <w:color w:val="1A376C"/>
+          <w:sz w:val="21"/>
+        </w:rPr>
+        <w:t>Carrier assigned</w:t>
+      </w:r>
+    </w:p>
+    <w:p>
+      <w:pPr>
+        <w:pStyle w:val="ListBullet"/>
+        <w:spacing w:after="80"/>
+      </w:pPr>
+      <w:r>
+        <w:rPr>
+          <w:b/>
+          <w:color w:val="1A376C"/>
+          <w:sz w:val="21"/>
+        </w:rPr>
+        <w:t>Pickup completed</w:t>
+      </w:r>
+    </w:p>
+    <w:p>
+      <w:pPr>
+        <w:pStyle w:val="ListBullet"/>
+        <w:spacing w:after="80"/>
+      </w:pPr>
+      <w:r>
+        <w:rPr>
+          <w:b/>
+          <w:color w:val="1A376C"/>
+          <w:sz w:val="21"/>
+        </w:rPr>
+        <w:t>Shipment in transit</w:t>
+      </w:r>
+    </w:p>
+    <w:p>
+      <w:pPr>
+        <w:pStyle w:val="ListBullet"/>
+        <w:spacing w:after="80"/>
+      </w:pPr>
+      <w:r>
+        <w:rPr>
+          <w:b/>
+          <w:color w:val="1A376C"/>
+          <w:sz w:val="21"/>
+        </w:rPr>
+        <w:t>Shipment delivered</w:t>
+      </w:r>
+    </w:p>
+    <w:p>
+      <w:pPr>
+        <w:pStyle w:val="Heading2"/>
+        <w:spacing w:before="200" w:after="80"/>
+      </w:pPr>
+      <w:r>
+        <w:rPr>
+          <w:b/>
+          <w:color w:val="007B83"/>
+          <w:sz w:val="22"/>
+        </w:rPr>
+        <w:t>Location-Based Alerts</w:t>
+      </w:r>
+    </w:p>
+    <w:p>
+      <w:pPr>
+        <w:pStyle w:val="ListBullet"/>
+        <w:spacing w:after="80"/>
+      </w:pPr>
+      <w:r>
+        <w:rPr>
+          <w:b/>
+          <w:color w:val="1A376C"/>
+          <w:sz w:val="21"/>
+        </w:rPr>
+        <w:t>Vehicle arrived at pickup location</w:t>
+      </w:r>
+    </w:p>
+    <w:p>
+      <w:pPr>
+        <w:pStyle w:val="ListBullet"/>
+        <w:spacing w:after="80"/>
+      </w:pPr>
+      <w:r>
+        <w:rPr>
+          <w:b/>
+          <w:color w:val="1A376C"/>
+          <w:sz w:val="21"/>
+        </w:rPr>
+        <w:t>Vehicle departed pickup location</w:t>
+      </w:r>
+    </w:p>
+    <w:p>
+      <w:pPr>
+        <w:pStyle w:val="ListBullet"/>
+        <w:spacing w:after="80"/>
+      </w:pPr>
+      <w:r>
+        <w:rPr>
+          <w:b/>
+          <w:color w:val="1A376C"/>
+          <w:sz w:val="21"/>
+        </w:rPr>
+        <w:t>Vehicle arrived at destination</w:t>
+      </w:r>
+    </w:p>
+    <w:p>
+      <w:pPr>
+        <w:pStyle w:val="Heading2"/>
+        <w:spacing w:before="200" w:after="80"/>
+      </w:pPr>
+      <w:r>
+        <w:rPr>
+          <w:b/>
+          <w:color w:val="007B83"/>
+          <w:sz w:val="22"/>
+        </w:rPr>
+        <w:t>Administrative Alerts</w:t>
+      </w:r>
+    </w:p>
+    <w:p>
+      <w:pPr>
+        <w:pStyle w:val="ListBullet"/>
+        <w:spacing w:after="80"/>
+      </w:pPr>
+      <w:r>
+        <w:rPr>
+          <w:b/>
+          <w:color w:val="1A376C"/>
+          <w:sz w:val="21"/>
+        </w:rPr>
+        <w:t>Tracking interruption detection</w:t>
+      </w:r>
+    </w:p>
+    <w:p>
+      <w:pPr>
+        <w:pStyle w:val="ListBullet"/>
+        <w:spacing w:after="80"/>
+      </w:pPr>
+      <w:r>
+        <w:rPr>
+          <w:b/>
+          <w:color w:val="1A376C"/>
+          <w:sz w:val="21"/>
+        </w:rPr>
+        <w:t>Delayed shipment notifications</w:t>
+      </w:r>
+    </w:p>
+    <w:p>
+      <w:pPr>
+        <w:pStyle w:val="ListBullet"/>
+        <w:spacing w:after="80"/>
+      </w:pPr>
+      <w:r>
+        <w:rPr>
+          <w:b/>
+          <w:color w:val="1A376C"/>
+          <w:sz w:val="21"/>
+        </w:rPr>
+        <w:t>Route deviation notifications</w:t>
+      </w:r>
+    </w:p>
+    <w:p>
+      <w:pPr>
+        <w:pStyle w:val="Heading2"/>
+        <w:spacing w:before="200" w:after="80"/>
+      </w:pPr>
+      <w:r>
+        <w:rPr>
+          <w:b/>
+          <w:color w:val="007B83"/>
+          <w:sz w:val="22"/>
+        </w:rPr>
+        <w:t>Deliverables</w:t>
+      </w:r>
+    </w:p>
+    <w:p>
+      <w:pPr>
+        <w:pStyle w:val="ListBullet"/>
+        <w:spacing w:after="80"/>
+      </w:pPr>
+      <w:r>
+        <w:rPr>
+          <w:b/>
+          <w:color w:val="1A376C"/>
+          <w:sz w:val="21"/>
+        </w:rPr>
+        <w:t>Notification Service</w:t>
+      </w:r>
+    </w:p>
+    <w:p>
+      <w:pPr>
+        <w:pStyle w:val="ListBullet"/>
+        <w:spacing w:after="80"/>
+      </w:pPr>
+      <w:r>
+        <w:rPr>
+          <w:b/>
+          <w:color w:val="1A376C"/>
+          <w:sz w:val="21"/>
+        </w:rPr>
+        <w:t>Alert Management System</w:t>
+      </w:r>
+    </w:p>
+    <w:p>
+      <w:pPr>
+        <w:pStyle w:val="ListBullet"/>
+        <w:spacing w:after="80"/>
+      </w:pPr>
+      <w:r>
+        <w:rPr>
+          <w:b/>
+          <w:color w:val="1A376C"/>
+          <w:sz w:val="21"/>
+        </w:rPr>
+        <w:t>User Notification Center</w:t>
+      </w:r>
+    </w:p>
+    <w:p>
+      <w:pPr>
+        <w:pStyle w:val="Heading2"/>
+        <w:spacing w:before="200" w:after="80"/>
+      </w:pPr>
+      <w:r>
+        <w:rPr>
+          <w:b/>
+          <w:color w:val="007B83"/>
+          <w:sz w:val="22"/>
+        </w:rPr>
+        <w:t>Business Benefits</w:t>
+      </w:r>
+    </w:p>
+    <w:p>
+      <w:pPr>
+        <w:pStyle w:val="ListBullet"/>
+        <w:spacing w:after="80"/>
+      </w:pPr>
+      <w:r>
+        <w:rPr>
+          <w:b/>
+          <w:color w:val="1A376C"/>
+          <w:sz w:val="21"/>
+        </w:rPr>
+        <w:t>Faster communication</w:t>
+      </w:r>
+    </w:p>
+    <w:p>
+      <w:pPr>
+        <w:pStyle w:val="ListBullet"/>
+        <w:spacing w:after="80"/>
+      </w:pPr>
+      <w:r>
+        <w:rPr>
+          <w:b/>
+          <w:color w:val="1A376C"/>
+          <w:sz w:val="21"/>
+        </w:rPr>
+        <w:t>Improved shipment awareness</w:t>
+      </w:r>
+    </w:p>
+    <w:p>
+      <w:pPr>
+        <w:pStyle w:val="ListBullet"/>
+        <w:spacing w:after="80"/>
+      </w:pPr>
+      <w:r>
+        <w:rPr>
+          <w:b/>
+          <w:color w:val="1A376C"/>
+          <w:sz w:val="21"/>
+        </w:rPr>
+        <w:t>Reduced operational delays</w:t>
+      </w:r>
+    </w:p>
+    <w:p>
+      <w:pPr>
+        <w:pStyle w:val="Heading1"/>
+        <w:spacing w:before="280" w:after="120"/>
+        <w:shd w:val="clear" w:color="auto" w:fill="1A376C"/>
+      </w:pPr>
+      <w:r>
+        <w:rPr>
+          <w:b/>
+          <w:color w:val="FFFFFF"/>
+          <w:sz w:val="26"/>
+        </w:rPr>
+        <w:t xml:space="preserve">  8.  Phase 7: Carrier Performance &amp; Analytics</w:t>
+      </w:r>
+    </w:p>
+    <w:p>
+      <w:pPr>
+        <w:pStyle w:val="Heading2"/>
+        <w:spacing w:before="200" w:after="80"/>
+      </w:pPr>
+      <w:r>
+        <w:rPr>
+          <w:b/>
+          <w:color w:val="007B83"/>
+          <w:sz w:val="22"/>
+        </w:rPr>
+        <w:t>Objective</w:t>
+      </w:r>
+    </w:p>
+    <w:p>
+      <w:pPr>
+        <w:spacing w:after="120"/>
+      </w:pPr>
+      <w:r>
+        <w:rPr>
+          <w:color w:val="404040"/>
+          <w:sz w:val="21"/>
+        </w:rPr>
+        <w:t>Leverage tracking data to measure operational performance.</w:t>
+      </w:r>
+    </w:p>
+    <w:p>
+      <w:pPr>
+        <w:pStyle w:val="Heading2"/>
+        <w:spacing w:before="200" w:after="80"/>
+      </w:pPr>
+      <w:r>
+        <w:rPr>
+          <w:b/>
+          <w:color w:val="007B83"/>
+          <w:sz w:val="22"/>
+        </w:rPr>
+        <w:t>Scope</w:t>
+      </w:r>
+    </w:p>
+    <w:p>
+      <w:pPr>
+        <w:pStyle w:val="Heading2"/>
+        <w:spacing w:before="200" w:after="80"/>
+      </w:pPr>
+      <w:r>
+        <w:rPr>
+          <w:b/>
+          <w:color w:val="007B83"/>
+          <w:sz w:val="22"/>
+        </w:rPr>
+        <w:t>Carrier Performance Metrics</w:t>
+      </w:r>
+    </w:p>
+    <w:p>
+      <w:pPr>
+        <w:pStyle w:val="ListBullet"/>
+        <w:spacing w:after="80"/>
+      </w:pPr>
+      <w:r>
+        <w:rPr>
+          <w:b/>
+          <w:color w:val="1A376C"/>
+          <w:sz w:val="21"/>
+        </w:rPr>
+        <w:t>Delivery completion rates</w:t>
+      </w:r>
+    </w:p>
+    <w:p>
+      <w:pPr>
+        <w:pStyle w:val="ListBullet"/>
+        <w:spacing w:after="80"/>
+      </w:pPr>
+      <w:r>
+        <w:rPr>
+          <w:b/>
+          <w:color w:val="1A376C"/>
+          <w:sz w:val="21"/>
+        </w:rPr>
+        <w:t>Average delivery times</w:t>
+      </w:r>
+    </w:p>
+    <w:p>
+      <w:pPr>
+        <w:pStyle w:val="ListBullet"/>
+        <w:spacing w:after="80"/>
+      </w:pPr>
+      <w:r>
+        <w:rPr>
+          <w:b/>
+          <w:color w:val="1A376C"/>
+          <w:sz w:val="21"/>
+        </w:rPr>
+        <w:t>On-time delivery performance</w:t>
+      </w:r>
+    </w:p>
+    <w:p>
+      <w:pPr>
+        <w:pStyle w:val="Heading2"/>
+        <w:spacing w:before="200" w:after="80"/>
+      </w:pPr>
+      <w:r>
+        <w:rPr>
+          <w:b/>
+          <w:color w:val="007B83"/>
+          <w:sz w:val="22"/>
+        </w:rPr>
+        <w:t>Vehicle Utilization Metrics</w:t>
+      </w:r>
+    </w:p>
+    <w:p>
+      <w:pPr>
+        <w:pStyle w:val="ListBullet"/>
+        <w:spacing w:after="80"/>
+      </w:pPr>
+      <w:r>
+        <w:rPr>
+          <w:b/>
+          <w:color w:val="1A376C"/>
+          <w:sz w:val="21"/>
+        </w:rPr>
+        <w:t>Active operating hours</w:t>
+      </w:r>
+    </w:p>
+    <w:p>
+      <w:pPr>
+        <w:pStyle w:val="ListBullet"/>
+        <w:spacing w:after="80"/>
+      </w:pPr>
+      <w:r>
+        <w:rPr>
+          <w:b/>
+          <w:color w:val="1A376C"/>
+          <w:sz w:val="21"/>
+        </w:rPr>
+        <w:t>Distance traveled</w:t>
+      </w:r>
+    </w:p>
+    <w:p>
+      <w:pPr>
+        <w:pStyle w:val="ListBullet"/>
+        <w:spacing w:after="80"/>
+      </w:pPr>
+      <w:r>
+        <w:rPr>
+          <w:b/>
+          <w:color w:val="1A376C"/>
+          <w:sz w:val="21"/>
+        </w:rPr>
+        <w:t>Asset utilization reports</w:t>
+      </w:r>
+    </w:p>
+    <w:p>
+      <w:pPr>
+        <w:pStyle w:val="Heading2"/>
+        <w:spacing w:before="200" w:after="80"/>
+      </w:pPr>
+      <w:r>
+        <w:rPr>
+          <w:b/>
+          <w:color w:val="007B83"/>
+          <w:sz w:val="22"/>
+        </w:rPr>
+        <w:t>Operational Dashboards</w:t>
+      </w:r>
+    </w:p>
+    <w:p>
+      <w:pPr>
+        <w:pStyle w:val="ListBullet"/>
+        <w:spacing w:after="80"/>
+      </w:pPr>
+      <w:r>
+        <w:rPr>
+          <w:b/>
+          <w:color w:val="1A376C"/>
+          <w:sz w:val="21"/>
+        </w:rPr>
+        <w:t>Fleet activity overview</w:t>
+      </w:r>
+    </w:p>
+    <w:p>
+      <w:pPr>
+        <w:pStyle w:val="ListBullet"/>
+        <w:spacing w:after="80"/>
+      </w:pPr>
+      <w:r>
+        <w:rPr>
+          <w:b/>
+          <w:color w:val="1A376C"/>
+          <w:sz w:val="21"/>
+        </w:rPr>
+        <w:t>Shipment activity overview</w:t>
+      </w:r>
+    </w:p>
+    <w:p>
+      <w:pPr>
+        <w:pStyle w:val="ListBullet"/>
+        <w:spacing w:after="80"/>
+      </w:pPr>
+      <w:r>
+        <w:rPr>
+          <w:b/>
+          <w:color w:val="1A376C"/>
+          <w:sz w:val="21"/>
+        </w:rPr>
+        <w:t>Delivery performance reporting</w:t>
+      </w:r>
+    </w:p>
+    <w:p>
+      <w:pPr>
+        <w:pStyle w:val="Heading2"/>
+        <w:spacing w:before="200" w:after="80"/>
+      </w:pPr>
+      <w:r>
+        <w:rPr>
+          <w:b/>
+          <w:color w:val="007B83"/>
+          <w:sz w:val="22"/>
+        </w:rPr>
+        <w:t>Carrier Rating &amp; Review Integration</w:t>
+      </w:r>
+    </w:p>
+    <w:p>
+      <w:pPr>
+        <w:pStyle w:val="ListBullet"/>
+        <w:spacing w:after="80"/>
+      </w:pPr>
+      <w:r>
+        <w:rPr>
+          <w:b/>
+          <w:color w:val="1A376C"/>
+          <w:sz w:val="21"/>
+        </w:rPr>
+        <w:t>Post-delivery ratings</w:t>
+      </w:r>
+    </w:p>
+    <w:p>
+      <w:pPr>
+        <w:pStyle w:val="ListBullet"/>
+        <w:spacing w:after="80"/>
+      </w:pPr>
+      <w:r>
+        <w:rPr>
+          <w:b/>
+          <w:color w:val="1A376C"/>
+          <w:sz w:val="21"/>
+        </w:rPr>
+        <w:t>Customer feedback</w:t>
+      </w:r>
+    </w:p>
+    <w:p>
+      <w:pPr>
+        <w:pStyle w:val="ListBullet"/>
+        <w:spacing w:after="80"/>
+      </w:pPr>
+      <w:r>
+        <w:rPr>
+          <w:b/>
+          <w:color w:val="1A376C"/>
+          <w:sz w:val="21"/>
+        </w:rPr>
+        <w:t>Reputation scoring</w:t>
+      </w:r>
+    </w:p>
+    <w:p>
+      <w:pPr>
+        <w:pStyle w:val="Heading2"/>
+        <w:spacing w:before="200" w:after="80"/>
+      </w:pPr>
+      <w:r>
+        <w:rPr>
+          <w:b/>
+          <w:color w:val="007B83"/>
+          <w:sz w:val="22"/>
+        </w:rPr>
+        <w:t>Deliverables</w:t>
+      </w:r>
+    </w:p>
+    <w:p>
+      <w:pPr>
+        <w:pStyle w:val="ListBullet"/>
+        <w:spacing w:after="80"/>
+      </w:pPr>
+      <w:r>
+        <w:rPr>
+          <w:b/>
+          <w:color w:val="1A376C"/>
+          <w:sz w:val="21"/>
+        </w:rPr>
+        <w:t>Performance Dashboard</w:t>
+      </w:r>
+    </w:p>
+    <w:p>
+      <w:pPr>
+        <w:pStyle w:val="ListBullet"/>
+        <w:spacing w:after="80"/>
+      </w:pPr>
+      <w:r>
+        <w:rPr>
+          <w:b/>
+          <w:color w:val="1A376C"/>
+          <w:sz w:val="21"/>
+        </w:rPr>
+        <w:t>Carrier Analytics</w:t>
+      </w:r>
+    </w:p>
+    <w:p>
+      <w:pPr>
+        <w:pStyle w:val="ListBullet"/>
+        <w:spacing w:after="80"/>
+      </w:pPr>
+      <w:r>
+        <w:rPr>
+          <w:b/>
+          <w:color w:val="1A376C"/>
+          <w:sz w:val="21"/>
+        </w:rPr>
+        <w:t>Rating &amp; Review System</w:t>
+      </w:r>
+    </w:p>
+    <w:p>
+      <w:pPr>
+        <w:pStyle w:val="ListBullet"/>
+        <w:spacing w:after="80"/>
+      </w:pPr>
+      <w:r>
+        <w:rPr>
+          <w:b/>
+          <w:color w:val="1A376C"/>
+          <w:sz w:val="21"/>
+        </w:rPr>
+        <w:t>Operational Reporting</w:t>
+      </w:r>
+    </w:p>
+    <w:p>
+      <w:pPr>
+        <w:pStyle w:val="Heading2"/>
+        <w:spacing w:before="200" w:after="80"/>
+      </w:pPr>
+      <w:r>
+        <w:rPr>
+          <w:b/>
+          <w:color w:val="007B83"/>
+          <w:sz w:val="22"/>
+        </w:rPr>
+        <w:t>Business Benefits</w:t>
+      </w:r>
+    </w:p>
+    <w:p>
+      <w:pPr>
+        <w:pStyle w:val="ListBullet"/>
+        <w:spacing w:after="80"/>
+      </w:pPr>
+      <w:r>
+        <w:rPr>
+          <w:b/>
+          <w:color w:val="1A376C"/>
+          <w:sz w:val="21"/>
+        </w:rPr>
+        <w:t>Data-driven decision making</w:t>
+      </w:r>
+    </w:p>
+    <w:p>
+      <w:pPr>
+        <w:pStyle w:val="ListBullet"/>
+        <w:spacing w:after="80"/>
+      </w:pPr>
+      <w:r>
+        <w:rPr>
+          <w:b/>
+          <w:color w:val="1A376C"/>
+          <w:sz w:val="21"/>
+        </w:rPr>
+        <w:t>Improved carrier accountability</w:t>
+      </w:r>
+    </w:p>
+    <w:p>
+      <w:pPr>
+        <w:pStyle w:val="ListBullet"/>
+        <w:spacing w:after="80"/>
+      </w:pPr>
+      <w:r>
+        <w:rPr>
+          <w:b/>
+          <w:color w:val="1A376C"/>
+          <w:sz w:val="21"/>
+        </w:rPr>
+        <w:t>Better service quality monitoring</w:t>
+      </w:r>
+    </w:p>
+    <w:p>
+      <w:pPr>
+        <w:pStyle w:val="ListBullet"/>
+        <w:spacing w:after="80"/>
+      </w:pPr>
+      <w:r>
+        <w:rPr>
+          <w:b/>
+          <w:color w:val="1A376C"/>
+          <w:sz w:val="21"/>
+        </w:rPr>
+        <w:t>Enhanced marketplace trust</w:t>
+      </w:r>
+    </w:p>
+    <w:p>
+      <w:pPr>
+        <w:pStyle w:val="Heading1"/>
+        <w:spacing w:before="280" w:after="120"/>
+        <w:shd w:val="clear" w:color="auto" w:fill="1A376C"/>
+      </w:pPr>
+      <w:r>
+        <w:rPr>
+          <w:b/>
+          <w:color w:val="FFFFFF"/>
+          <w:sz w:val="26"/>
+        </w:rPr>
+        <w:t xml:space="preserve">  9.  Recommended Implementation Timeline</w:t>
       </w:r>
     </w:p>
     <w:tbl>
@@ -404,7 +3088,7 @@
                 <w:color w:val="FFFFFF"/>
                 <w:sz w:val="21"/>
               </w:rPr>
-              <w:t>Primary Deliverable</w:t>
+              <w:t>Deliverable</w:t>
             </w:r>
           </w:p>
         </w:tc>
@@ -467,7 +3151,7 @@
                 <w:color w:val="404040"/>
                 <w:sz w:val="21"/>
               </w:rPr>
-              <w:t>Tracking foundation &amp; integration</w:t>
+              <w:t>Tracking Infrastructure Integration</w:t>
             </w:r>
           </w:p>
         </w:tc>
@@ -529,7 +3213,7 @@
                 <w:color w:val="404040"/>
                 <w:sz w:val="21"/>
               </w:rPr>
-              <w:t>Live shipment visibility</w:t>
+              <w:t>Real-Time Shipment Tracking</w:t>
             </w:r>
           </w:p>
         </w:tc>
@@ -591,7 +3275,7 @@
                 <w:color w:val="404040"/>
                 <w:sz w:val="21"/>
               </w:rPr>
-              <w:t>Route history &amp; playback</w:t>
+              <w:t>Route Playback</w:t>
             </w:r>
           </w:p>
         </w:tc>
@@ -653,7 +3337,7 @@
                 <w:color w:val="404040"/>
                 <w:sz w:val="21"/>
               </w:rPr>
-              <w:t>Geofence automation</w:t>
+              <w:t>Geofence Automation</w:t>
             </w:r>
           </w:p>
         </w:tc>
@@ -715,7 +3399,7 @@
                 <w:color w:val="404040"/>
                 <w:sz w:val="21"/>
               </w:rPr>
-              <w:t>Status automation engine</w:t>
+              <w:t>Shipment Status Automation</w:t>
             </w:r>
           </w:p>
         </w:tc>
@@ -777,7 +3461,7 @@
                 <w:color w:val="404040"/>
                 <w:sz w:val="21"/>
               </w:rPr>
-              <w:t>Notifications &amp; alerting</w:t>
+              <w:t>Notifications &amp; Alerts</w:t>
             </w:r>
           </w:p>
         </w:tc>
@@ -839,7 +3523,7 @@
                 <w:color w:val="404040"/>
                 <w:sz w:val="21"/>
               </w:rPr>
-              <w:t>Analytics &amp; carrier performance</w:t>
+              <w:t>Analytics, Ratings &amp; Performance</w:t>
             </w:r>
           </w:p>
         </w:tc>
@@ -878,7 +3562,7 @@
           <w:color w:val="FFFFFF"/>
           <w:sz w:val="26"/>
         </w:rPr>
-        <w:t xml:space="preserve">  3.  Phase 1 — Tracking Foundation</w:t>
+        <w:t xml:space="preserve">  10.  Strategic Outcome</w:t>
       </w:r>
     </w:p>
     <w:p>
@@ -890,21 +3574,7 @@
           <w:color w:val="404040"/>
           <w:sz w:val="21"/>
         </w:rPr>
-        <w:t>Establish the technical backbone for tracking by registering vehicles, linking shipments, and ingesting location updates reliably.</w:t>
-      </w:r>
-    </w:p>
-    <w:p>
-      <w:pPr>
-        <w:pStyle w:val="Heading2"/>
-        <w:spacing w:before="200" w:after="80"/>
-      </w:pPr>
-      <w:r>
-        <w:rPr>
-          <w:b/>
-          <w:color w:val="007B83"/>
-          <w:sz w:val="22"/>
-        </w:rPr>
-        <w:t>Core Capabilities</w:t>
+        <w:t>Upon completion of this roadmap, the platform will evolve from a shipment management system into a fully trackable logistics ecosystem capable of providing:</w:t>
       </w:r>
     </w:p>
     <w:p>
@@ -918,14 +3588,7 @@
           <w:color w:val="1A376C"/>
           <w:sz w:val="21"/>
         </w:rPr>
-        <w:t>Vehicle registry:</w:t>
-      </w:r>
-      <w:r>
-        <w:rPr>
-          <w:color w:val="404040"/>
-          <w:sz w:val="21"/>
-        </w:rPr>
-        <w:t xml:space="preserve"> Maintain vehicle profiles, identifiers, and carrier ownership details.</w:t>
+        <w:t>Real-time shipment visibility</w:t>
       </w:r>
     </w:p>
     <w:p>
@@ -939,14 +3602,7 @@
           <w:color w:val="1A376C"/>
           <w:sz w:val="21"/>
         </w:rPr>
-        <w:t>Shipment assignment:</w:t>
-      </w:r>
-      <w:r>
-        <w:rPr>
-          <w:color w:val="404040"/>
-          <w:sz w:val="21"/>
-        </w:rPr>
-        <w:t xml:space="preserve"> Bind shipments to vehicles with active and historical relationships.</w:t>
+        <w:t>Route history and playback</w:t>
       </w:r>
     </w:p>
     <w:p>
@@ -960,14 +3616,7 @@
           <w:color w:val="1A376C"/>
           <w:sz w:val="21"/>
         </w:rPr>
-        <w:t>Telemetry ingestion:</w:t>
-      </w:r>
-      <w:r>
-        <w:rPr>
-          <w:color w:val="404040"/>
-          <w:sz w:val="21"/>
-        </w:rPr>
-        <w:t xml:space="preserve"> Receive position updates, status signals, and last-seen timestamps.</w:t>
+        <w:t>Automated location-based workflows</w:t>
       </w:r>
     </w:p>
     <w:p>
@@ -981,28 +3630,7 @@
           <w:color w:val="1A376C"/>
           <w:sz w:val="21"/>
         </w:rPr>
-        <w:t>Administration:</w:t>
-      </w:r>
-      <w:r>
-        <w:rPr>
-          <w:color w:val="404040"/>
-          <w:sz w:val="21"/>
-        </w:rPr>
-        <w:t xml:space="preserve"> Manage registrations, devices, and tracking configuration settings.</w:t>
-      </w:r>
-    </w:p>
-    <w:p>
-      <w:pPr>
-        <w:pStyle w:val="Heading2"/>
-        <w:spacing w:before="200" w:after="80"/>
-      </w:pPr>
-      <w:r>
-        <w:rPr>
-          <w:b/>
-          <w:color w:val="007B83"/>
-          <w:sz w:val="22"/>
-        </w:rPr>
-        <w:t>Deliverables</w:t>
+        <w:t>Delivery verification</w:t>
       </w:r>
     </w:p>
     <w:p>
@@ -1016,14 +3644,7 @@
           <w:color w:val="1A376C"/>
           <w:sz w:val="21"/>
         </w:rPr>
-        <w:t>Vehicle management module:</w:t>
-      </w:r>
-      <w:r>
-        <w:rPr>
-          <w:color w:val="404040"/>
-          <w:sz w:val="21"/>
-        </w:rPr>
-        <w:t xml:space="preserve"> Vehicle profiles and carrier links.</w:t>
+        <w:t>Intelligent notifications</w:t>
       </w:r>
     </w:p>
     <w:p>
@@ -1037,14 +3658,7 @@
           <w:color w:val="1A376C"/>
           <w:sz w:val="21"/>
         </w:rPr>
-        <w:t>Shipment-to-vehicle assignment:</w:t>
-      </w:r>
-      <w:r>
-        <w:rPr>
-          <w:color w:val="404040"/>
-          <w:sz w:val="21"/>
-        </w:rPr>
-        <w:t xml:space="preserve"> Assignment workflow and history.</w:t>
+        <w:t>Carrier accountability</w:t>
       </w:r>
     </w:p>
     <w:p>
@@ -1058,14 +3672,7 @@
           <w:color w:val="1A376C"/>
           <w:sz w:val="21"/>
         </w:rPr>
-        <w:t>Tracking integration layer:</w:t>
-      </w:r>
-      <w:r>
-        <w:rPr>
-          <w:color w:val="404040"/>
-          <w:sz w:val="21"/>
-        </w:rPr>
-        <w:t xml:space="preserve"> Location processing and storage.</w:t>
+        <w:t>Operational analytics</w:t>
       </w:r>
     </w:p>
     <w:p>
@@ -1079,1582 +3686,19 @@
           <w:color w:val="1A376C"/>
           <w:sz w:val="21"/>
         </w:rPr>
-        <w:t>Tracking admin console:</w:t>
+        <w:t>Enhanced customer confidence</w:t>
       </w:r>
+    </w:p>
+    <w:p>
+      <w:pPr>
+        <w:spacing w:after="120"/>
+      </w:pPr>
       <w:r>
         <w:rPr>
           <w:color w:val="404040"/>
           <w:sz w:val="21"/>
         </w:rPr>
-        <w:t xml:space="preserve"> Configuration and device management.</w:t>
-      </w:r>
-    </w:p>
-    <w:p>
-      <w:pPr>
-        <w:pStyle w:val="Heading2"/>
-        <w:spacing w:before="200" w:after="80"/>
-      </w:pPr>
-      <w:r>
-        <w:rPr>
-          <w:b/>
-          <w:color w:val="007B83"/>
-          <w:sz w:val="22"/>
-        </w:rPr>
-        <w:t>Business Value</w:t>
-      </w:r>
-    </w:p>
-    <w:p>
-      <w:pPr>
-        <w:pStyle w:val="ListBullet"/>
-        <w:spacing w:after="80"/>
-      </w:pPr>
-      <w:r>
-        <w:rPr>
-          <w:b/>
-          <w:color w:val="1A376C"/>
-          <w:sz w:val="21"/>
-        </w:rPr>
-        <w:t>Foundational readiness:</w:t>
-      </w:r>
-      <w:r>
-        <w:rPr>
-          <w:color w:val="404040"/>
-          <w:sz w:val="21"/>
-        </w:rPr>
-        <w:t xml:space="preserve"> Enables all downstream tracking features.</w:t>
-      </w:r>
-    </w:p>
-    <w:p>
-      <w:pPr>
-        <w:pStyle w:val="ListBullet"/>
-        <w:spacing w:after="80"/>
-      </w:pPr>
-      <w:r>
-        <w:rPr>
-          <w:b/>
-          <w:color w:val="1A376C"/>
-          <w:sz w:val="21"/>
-        </w:rPr>
-        <w:t>Better oversight:</w:t>
-      </w:r>
-      <w:r>
-        <w:rPr>
-          <w:color w:val="404040"/>
-          <w:sz w:val="21"/>
-        </w:rPr>
-        <w:t xml:space="preserve"> Improves visibility into active operations.</w:t>
-      </w:r>
-    </w:p>
-    <w:p>
-      <w:pPr>
-        <w:pStyle w:val="Heading1"/>
-        <w:spacing w:before="280" w:after="120"/>
-        <w:shd w:val="clear" w:color="auto" w:fill="1A376C"/>
-      </w:pPr>
-      <w:r>
-        <w:rPr>
-          <w:b/>
-          <w:color w:val="FFFFFF"/>
-          <w:sz w:val="26"/>
-        </w:rPr>
-        <w:t xml:space="preserve">  4.  Phase 2 — Live Shipment Tracking</w:t>
-      </w:r>
-    </w:p>
-    <w:p>
-      <w:pPr>
-        <w:spacing w:after="120"/>
-      </w:pPr>
-      <w:r>
-        <w:rPr>
-          <w:color w:val="404040"/>
-          <w:sz w:val="21"/>
-        </w:rPr>
-        <w:t>Expose real-time tracking views for shippers, carriers, and administrators with map-based monitoring and up-to-date status indicators.</w:t>
-      </w:r>
-    </w:p>
-    <w:p>
-      <w:pPr>
-        <w:pStyle w:val="Heading2"/>
-        <w:spacing w:before="200" w:after="80"/>
-      </w:pPr>
-      <w:r>
-        <w:rPr>
-          <w:b/>
-          <w:color w:val="007B83"/>
-          <w:sz w:val="22"/>
-        </w:rPr>
-        <w:t>Core Capabilities</w:t>
-      </w:r>
-    </w:p>
-    <w:p>
-      <w:pPr>
-        <w:pStyle w:val="ListBullet"/>
-        <w:spacing w:after="80"/>
-      </w:pPr>
-      <w:r>
-        <w:rPr>
-          <w:b/>
-          <w:color w:val="1A376C"/>
-          <w:sz w:val="21"/>
-        </w:rPr>
-        <w:t>Live location:</w:t>
-      </w:r>
-      <w:r>
-        <w:rPr>
-          <w:color w:val="404040"/>
-          <w:sz w:val="21"/>
-        </w:rPr>
-        <w:t xml:space="preserve"> Show current vehicle position with last update time.</w:t>
-      </w:r>
-    </w:p>
-    <w:p>
-      <w:pPr>
-        <w:pStyle w:val="ListBullet"/>
-        <w:spacing w:after="80"/>
-      </w:pPr>
-      <w:r>
-        <w:rPr>
-          <w:b/>
-          <w:color w:val="1A376C"/>
-          <w:sz w:val="21"/>
-        </w:rPr>
-        <w:t>Tracking dashboard:</w:t>
-      </w:r>
-      <w:r>
-        <w:rPr>
-          <w:color w:val="404040"/>
-          <w:sz w:val="21"/>
-        </w:rPr>
-        <w:t xml:space="preserve"> Monitor active shipments on a real-time map.</w:t>
-      </w:r>
-    </w:p>
-    <w:p>
-      <w:pPr>
-        <w:pStyle w:val="ListBullet"/>
-        <w:spacing w:after="80"/>
-      </w:pPr>
-      <w:r>
-        <w:rPr>
-          <w:b/>
-          <w:color w:val="1A376C"/>
-          <w:sz w:val="21"/>
-        </w:rPr>
-        <w:t>Shipment tracking page:</w:t>
-      </w:r>
-      <w:r>
-        <w:rPr>
-          <w:color w:val="404040"/>
-          <w:sz w:val="21"/>
-        </w:rPr>
-        <w:t xml:space="preserve"> Display shipment, carrier, vehicle, location, status, and activity details.</w:t>
-      </w:r>
-    </w:p>
-    <w:p>
-      <w:pPr>
-        <w:pStyle w:val="ListBullet"/>
-        <w:spacing w:after="80"/>
-      </w:pPr>
-      <w:r>
-        <w:rPr>
-          <w:b/>
-          <w:color w:val="1A376C"/>
-          <w:sz w:val="21"/>
-        </w:rPr>
-        <w:t>History capture:</w:t>
-      </w:r>
-      <w:r>
-        <w:rPr>
-          <w:color w:val="404040"/>
-          <w:sz w:val="21"/>
-        </w:rPr>
-        <w:t xml:space="preserve"> Store position history for later review and investigation.</w:t>
-      </w:r>
-    </w:p>
-    <w:p>
-      <w:pPr>
-        <w:pStyle w:val="Heading2"/>
-        <w:spacing w:before="200" w:after="80"/>
-      </w:pPr>
-      <w:r>
-        <w:rPr>
-          <w:b/>
-          <w:color w:val="007B83"/>
-          <w:sz w:val="22"/>
-        </w:rPr>
-        <w:t>Deliverables</w:t>
-      </w:r>
-    </w:p>
-    <w:p>
-      <w:pPr>
-        <w:pStyle w:val="ListBullet"/>
-        <w:spacing w:after="80"/>
-      </w:pPr>
-      <w:r>
-        <w:rPr>
-          <w:b/>
-          <w:color w:val="1A376C"/>
-          <w:sz w:val="21"/>
-        </w:rPr>
-        <w:t>Live tracking dashboard:</w:t>
-      </w:r>
-      <w:r>
-        <w:rPr>
-          <w:color w:val="404040"/>
-          <w:sz w:val="21"/>
-        </w:rPr>
-        <w:t xml:space="preserve"> Operational map with active shipments.</w:t>
-      </w:r>
-    </w:p>
-    <w:p>
-      <w:pPr>
-        <w:pStyle w:val="ListBullet"/>
-        <w:spacing w:after="80"/>
-      </w:pPr>
-      <w:r>
-        <w:rPr>
-          <w:b/>
-          <w:color w:val="1A376C"/>
-          <w:sz w:val="21"/>
-        </w:rPr>
-        <w:t>Shipment tracking interface:</w:t>
-      </w:r>
-      <w:r>
-        <w:rPr>
-          <w:color w:val="404040"/>
-          <w:sz w:val="21"/>
-        </w:rPr>
-        <w:t xml:space="preserve"> Dedicated shipment visibility page.</w:t>
-      </w:r>
-    </w:p>
-    <w:p>
-      <w:pPr>
-        <w:pStyle w:val="ListBullet"/>
-        <w:spacing w:after="80"/>
-      </w:pPr>
-      <w:r>
-        <w:rPr>
-          <w:b/>
-          <w:color w:val="1A376C"/>
-          <w:sz w:val="21"/>
-        </w:rPr>
-        <w:t>Historical tracking records:</w:t>
-      </w:r>
-      <w:r>
-        <w:rPr>
-          <w:color w:val="404040"/>
-          <w:sz w:val="21"/>
-        </w:rPr>
-        <w:t xml:space="preserve"> Queryable movement history.</w:t>
-      </w:r>
-    </w:p>
-    <w:p>
-      <w:pPr>
-        <w:pStyle w:val="Heading2"/>
-        <w:spacing w:before="200" w:after="80"/>
-      </w:pPr>
-      <w:r>
-        <w:rPr>
-          <w:b/>
-          <w:color w:val="007B83"/>
-          <w:sz w:val="22"/>
-        </w:rPr>
-        <w:t>Business Value</w:t>
-      </w:r>
-    </w:p>
-    <w:p>
-      <w:pPr>
-        <w:pStyle w:val="ListBullet"/>
-        <w:spacing w:after="80"/>
-      </w:pPr>
-      <w:r>
-        <w:rPr>
-          <w:b/>
-          <w:color w:val="1A376C"/>
-          <w:sz w:val="21"/>
-        </w:rPr>
-        <w:t>Customer confidence:</w:t>
-      </w:r>
-      <w:r>
-        <w:rPr>
-          <w:color w:val="404040"/>
-          <w:sz w:val="21"/>
-        </w:rPr>
-        <w:t xml:space="preserve"> Fewer status calls and higher transparency.</w:t>
-      </w:r>
-    </w:p>
-    <w:p>
-      <w:pPr>
-        <w:pStyle w:val="ListBullet"/>
-        <w:spacing w:after="80"/>
-      </w:pPr>
-      <w:r>
-        <w:rPr>
-          <w:b/>
-          <w:color w:val="1A376C"/>
-          <w:sz w:val="21"/>
-        </w:rPr>
-        <w:t>Operational control:</w:t>
-      </w:r>
-      <w:r>
-        <w:rPr>
-          <w:color w:val="404040"/>
-          <w:sz w:val="21"/>
-        </w:rPr>
-        <w:t xml:space="preserve"> Immediate awareness of shipment progress.</w:t>
-      </w:r>
-    </w:p>
-    <w:p>
-      <w:pPr>
-        <w:pStyle w:val="Heading1"/>
-        <w:spacing w:before="280" w:after="120"/>
-        <w:shd w:val="clear" w:color="auto" w:fill="1A376C"/>
-      </w:pPr>
-      <w:r>
-        <w:rPr>
-          <w:b/>
-          <w:color w:val="FFFFFF"/>
-          <w:sz w:val="26"/>
-        </w:rPr>
-        <w:t xml:space="preserve">  5.  Phase 3 — Route History &amp; Playback</w:t>
-      </w:r>
-    </w:p>
-    <w:p>
-      <w:pPr>
-        <w:spacing w:after="120"/>
-      </w:pPr>
-      <w:r>
-        <w:rPr>
-          <w:color w:val="404040"/>
-          <w:sz w:val="21"/>
-        </w:rPr>
-        <w:t>Enable route playback and journey analysis for completed and in-progress shipments to support audits and operational review.</w:t>
-      </w:r>
-    </w:p>
-    <w:p>
-      <w:pPr>
-        <w:pStyle w:val="Heading2"/>
-        <w:spacing w:before="200" w:after="80"/>
-      </w:pPr>
-      <w:r>
-        <w:rPr>
-          <w:b/>
-          <w:color w:val="007B83"/>
-          <w:sz w:val="22"/>
-        </w:rPr>
-        <w:t>Core Capabilities</w:t>
-      </w:r>
-    </w:p>
-    <w:p>
-      <w:pPr>
-        <w:pStyle w:val="ListBullet"/>
-        <w:spacing w:after="80"/>
-      </w:pPr>
-      <w:r>
-        <w:rPr>
-          <w:b/>
-          <w:color w:val="1A376C"/>
-          <w:sz w:val="21"/>
-        </w:rPr>
-        <w:t>Route playback:</w:t>
-      </w:r>
-      <w:r>
-        <w:rPr>
-          <w:color w:val="404040"/>
-          <w:sz w:val="21"/>
-        </w:rPr>
-        <w:t xml:space="preserve"> Replay historical movement on a timeline.</w:t>
-      </w:r>
-    </w:p>
-    <w:p>
-      <w:pPr>
-        <w:pStyle w:val="ListBullet"/>
-        <w:spacing w:after="80"/>
-      </w:pPr>
-      <w:r>
-        <w:rPr>
-          <w:b/>
-          <w:color w:val="1A376C"/>
-          <w:sz w:val="21"/>
-        </w:rPr>
-        <w:t>Trip analytics:</w:t>
-      </w:r>
-      <w:r>
-        <w:rPr>
-          <w:color w:val="404040"/>
-          <w:sz w:val="21"/>
-        </w:rPr>
-        <w:t xml:space="preserve"> Summarize distance traveled, stops, and travel behavior.</w:t>
-      </w:r>
-    </w:p>
-    <w:p>
-      <w:pPr>
-        <w:pStyle w:val="ListBullet"/>
-        <w:spacing w:after="80"/>
-      </w:pPr>
-      <w:r>
-        <w:rPr>
-          <w:b/>
-          <w:color w:val="1A376C"/>
-          <w:sz w:val="21"/>
-        </w:rPr>
-        <w:t>Investigation tools:</w:t>
-      </w:r>
-      <w:r>
-        <w:rPr>
-          <w:color w:val="404040"/>
-          <w:sz w:val="21"/>
-        </w:rPr>
-        <w:t xml:space="preserve"> Validate deliveries and verify compliance with expected routes.</w:t>
-      </w:r>
-    </w:p>
-    <w:p>
-      <w:pPr>
-        <w:pStyle w:val="Heading2"/>
-        <w:spacing w:before="200" w:after="80"/>
-      </w:pPr>
-      <w:r>
-        <w:rPr>
-          <w:b/>
-          <w:color w:val="007B83"/>
-          <w:sz w:val="22"/>
-        </w:rPr>
-        <w:t>Deliverables</w:t>
-      </w:r>
-    </w:p>
-    <w:p>
-      <w:pPr>
-        <w:pStyle w:val="ListBullet"/>
-        <w:spacing w:after="80"/>
-      </w:pPr>
-      <w:r>
-        <w:rPr>
-          <w:b/>
-          <w:color w:val="1A376C"/>
-          <w:sz w:val="21"/>
-        </w:rPr>
-        <w:t>Playback interface:</w:t>
-      </w:r>
-      <w:r>
-        <w:rPr>
-          <w:color w:val="404040"/>
-          <w:sz w:val="21"/>
-        </w:rPr>
-        <w:t xml:space="preserve"> Time-based route visualization.</w:t>
-      </w:r>
-    </w:p>
-    <w:p>
-      <w:pPr>
-        <w:pStyle w:val="ListBullet"/>
-        <w:spacing w:after="80"/>
-      </w:pPr>
-      <w:r>
-        <w:rPr>
-          <w:b/>
-          <w:color w:val="1A376C"/>
-          <w:sz w:val="21"/>
-        </w:rPr>
-        <w:t>Journey reports:</w:t>
-      </w:r>
-      <w:r>
-        <w:rPr>
-          <w:color w:val="404040"/>
-          <w:sz w:val="21"/>
-        </w:rPr>
-        <w:t xml:space="preserve"> Exportable movement summaries.</w:t>
-      </w:r>
-    </w:p>
-    <w:p>
-      <w:pPr>
-        <w:pStyle w:val="ListBullet"/>
-        <w:spacing w:after="80"/>
-      </w:pPr>
-      <w:r>
-        <w:rPr>
-          <w:b/>
-          <w:color w:val="1A376C"/>
-          <w:sz w:val="21"/>
-        </w:rPr>
-        <w:t>Route analysis tools:</w:t>
-      </w:r>
-      <w:r>
-        <w:rPr>
-          <w:color w:val="404040"/>
-          <w:sz w:val="21"/>
-        </w:rPr>
-        <w:t xml:space="preserve"> Stop duration and distance insights.</w:t>
-      </w:r>
-    </w:p>
-    <w:p>
-      <w:pPr>
-        <w:pStyle w:val="Heading2"/>
-        <w:spacing w:before="200" w:after="80"/>
-      </w:pPr>
-      <w:r>
-        <w:rPr>
-          <w:b/>
-          <w:color w:val="007B83"/>
-          <w:sz w:val="22"/>
-        </w:rPr>
-        <w:t>Business Value</w:t>
-      </w:r>
-    </w:p>
-    <w:p>
-      <w:pPr>
-        <w:pStyle w:val="ListBullet"/>
-        <w:spacing w:after="80"/>
-      </w:pPr>
-      <w:r>
-        <w:rPr>
-          <w:b/>
-          <w:color w:val="1A376C"/>
-          <w:sz w:val="21"/>
-        </w:rPr>
-        <w:t>Audit readiness:</w:t>
-      </w:r>
-      <w:r>
-        <w:rPr>
-          <w:color w:val="404040"/>
-          <w:sz w:val="21"/>
-        </w:rPr>
-        <w:t xml:space="preserve"> Improves dispute resolution and verification.</w:t>
-      </w:r>
-    </w:p>
-    <w:p>
-      <w:pPr>
-        <w:pStyle w:val="ListBullet"/>
-        <w:spacing w:after="80"/>
-      </w:pPr>
-      <w:r>
-        <w:rPr>
-          <w:b/>
-          <w:color w:val="1A376C"/>
-          <w:sz w:val="21"/>
-        </w:rPr>
-        <w:t>Performance insights:</w:t>
-      </w:r>
-      <w:r>
-        <w:rPr>
-          <w:color w:val="404040"/>
-          <w:sz w:val="21"/>
-        </w:rPr>
-        <w:t xml:space="preserve"> Highlights operational efficiency gaps.</w:t>
-      </w:r>
-    </w:p>
-    <w:p>
-      <w:pPr>
-        <w:pStyle w:val="Heading1"/>
-        <w:spacing w:before="280" w:after="120"/>
-        <w:shd w:val="clear" w:color="auto" w:fill="1A376C"/>
-      </w:pPr>
-      <w:r>
-        <w:rPr>
-          <w:b/>
-          <w:color w:val="FFFFFF"/>
-          <w:sz w:val="26"/>
-        </w:rPr>
-        <w:t xml:space="preserve">  6.  Phase 4 — Geofence Automation</w:t>
-      </w:r>
-    </w:p>
-    <w:p>
-      <w:pPr>
-        <w:spacing w:after="120"/>
-      </w:pPr>
-      <w:r>
-        <w:rPr>
-          <w:color w:val="404040"/>
-          <w:sz w:val="21"/>
-        </w:rPr>
-        <w:t>Introduce location-based triggers for pickup and delivery sites to automate arrival/departure events and build a reliable audit trail.</w:t>
-      </w:r>
-    </w:p>
-    <w:p>
-      <w:pPr>
-        <w:pStyle w:val="Heading2"/>
-        <w:spacing w:before="200" w:after="80"/>
-      </w:pPr>
-      <w:r>
-        <w:rPr>
-          <w:b/>
-          <w:color w:val="007B83"/>
-          <w:sz w:val="22"/>
-        </w:rPr>
-        <w:t>Core Capabilities</w:t>
-      </w:r>
-    </w:p>
-    <w:p>
-      <w:pPr>
-        <w:pStyle w:val="ListBullet"/>
-        <w:spacing w:after="80"/>
-      </w:pPr>
-      <w:r>
-        <w:rPr>
-          <w:b/>
-          <w:color w:val="1A376C"/>
-          <w:sz w:val="21"/>
-        </w:rPr>
-        <w:t>Pickup geofences:</w:t>
-      </w:r>
-      <w:r>
-        <w:rPr>
-          <w:color w:val="404040"/>
-          <w:sz w:val="21"/>
-        </w:rPr>
-        <w:t xml:space="preserve"> Detect arrival and departure at origin sites.</w:t>
-      </w:r>
-    </w:p>
-    <w:p>
-      <w:pPr>
-        <w:pStyle w:val="ListBullet"/>
-        <w:spacing w:after="80"/>
-      </w:pPr>
-      <w:r>
-        <w:rPr>
-          <w:b/>
-          <w:color w:val="1A376C"/>
-          <w:sz w:val="21"/>
-        </w:rPr>
-        <w:t>Destination geofences:</w:t>
-      </w:r>
-      <w:r>
-        <w:rPr>
-          <w:color w:val="404040"/>
-          <w:sz w:val="21"/>
-        </w:rPr>
-        <w:t xml:space="preserve"> Confirm delivery zone entry and exit.</w:t>
-      </w:r>
-    </w:p>
-    <w:p>
-      <w:pPr>
-        <w:pStyle w:val="ListBullet"/>
-        <w:spacing w:after="80"/>
-      </w:pPr>
-      <w:r>
-        <w:rPr>
-          <w:b/>
-          <w:color w:val="1A376C"/>
-          <w:sz w:val="21"/>
-        </w:rPr>
-        <w:t>Event monitoring:</w:t>
-      </w:r>
-      <w:r>
-        <w:rPr>
-          <w:color w:val="404040"/>
-          <w:sz w:val="21"/>
-        </w:rPr>
-        <w:t xml:space="preserve"> Track entry, exit, and arrival milestones.</w:t>
-      </w:r>
-    </w:p>
-    <w:p>
-      <w:pPr>
-        <w:pStyle w:val="ListBullet"/>
-        <w:spacing w:after="80"/>
-      </w:pPr>
-      <w:r>
-        <w:rPr>
-          <w:b/>
-          <w:color w:val="1A376C"/>
-          <w:sz w:val="21"/>
-        </w:rPr>
-        <w:t>Event logging:</w:t>
-      </w:r>
-      <w:r>
-        <w:rPr>
-          <w:color w:val="404040"/>
-          <w:sz w:val="21"/>
-        </w:rPr>
-        <w:t xml:space="preserve"> Persist geofence activity for audits.</w:t>
-      </w:r>
-    </w:p>
-    <w:p>
-      <w:pPr>
-        <w:pStyle w:val="Heading2"/>
-        <w:spacing w:before="200" w:after="80"/>
-      </w:pPr>
-      <w:r>
-        <w:rPr>
-          <w:b/>
-          <w:color w:val="007B83"/>
-          <w:sz w:val="22"/>
-        </w:rPr>
-        <w:t>Deliverables</w:t>
-      </w:r>
-    </w:p>
-    <w:p>
-      <w:pPr>
-        <w:pStyle w:val="ListBullet"/>
-        <w:spacing w:after="80"/>
-      </w:pPr>
-      <w:r>
-        <w:rPr>
-          <w:b/>
-          <w:color w:val="1A376C"/>
-          <w:sz w:val="21"/>
-        </w:rPr>
-        <w:t>Geofence management:</w:t>
-      </w:r>
-      <w:r>
-        <w:rPr>
-          <w:color w:val="404040"/>
-          <w:sz w:val="21"/>
-        </w:rPr>
-        <w:t xml:space="preserve"> Create and manage location boundaries.</w:t>
-      </w:r>
-    </w:p>
-    <w:p>
-      <w:pPr>
-        <w:pStyle w:val="ListBullet"/>
-        <w:spacing w:after="80"/>
-      </w:pPr>
-      <w:r>
-        <w:rPr>
-          <w:b/>
-          <w:color w:val="1A376C"/>
-          <w:sz w:val="21"/>
-        </w:rPr>
-        <w:t>Event processing:</w:t>
-      </w:r>
-      <w:r>
-        <w:rPr>
-          <w:color w:val="404040"/>
-          <w:sz w:val="21"/>
-        </w:rPr>
-        <w:t xml:space="preserve"> Real-time geofence trigger handling.</w:t>
-      </w:r>
-    </w:p>
-    <w:p>
-      <w:pPr>
-        <w:pStyle w:val="ListBullet"/>
-        <w:spacing w:after="80"/>
-      </w:pPr>
-      <w:r>
-        <w:rPr>
-          <w:b/>
-          <w:color w:val="1A376C"/>
-          <w:sz w:val="21"/>
-        </w:rPr>
-        <w:t>Automated event history:</w:t>
-      </w:r>
-      <w:r>
-        <w:rPr>
-          <w:color w:val="404040"/>
-          <w:sz w:val="21"/>
-        </w:rPr>
-        <w:t xml:space="preserve"> Structured geofence audit trail.</w:t>
-      </w:r>
-    </w:p>
-    <w:p>
-      <w:pPr>
-        <w:pStyle w:val="Heading2"/>
-        <w:spacing w:before="200" w:after="80"/>
-      </w:pPr>
-      <w:r>
-        <w:rPr>
-          <w:b/>
-          <w:color w:val="007B83"/>
-          <w:sz w:val="22"/>
-        </w:rPr>
-        <w:t>Business Value</w:t>
-      </w:r>
-    </w:p>
-    <w:p>
-      <w:pPr>
-        <w:pStyle w:val="ListBullet"/>
-        <w:spacing w:after="80"/>
-      </w:pPr>
-      <w:r>
-        <w:rPr>
-          <w:b/>
-          <w:color w:val="1A376C"/>
-          <w:sz w:val="21"/>
-        </w:rPr>
-        <w:t>Reduced manual checks:</w:t>
-      </w:r>
-      <w:r>
-        <w:rPr>
-          <w:color w:val="404040"/>
-          <w:sz w:val="21"/>
-        </w:rPr>
-        <w:t xml:space="preserve"> Automates pickup/delivery confirmation.</w:t>
-      </w:r>
-    </w:p>
-    <w:p>
-      <w:pPr>
-        <w:pStyle w:val="ListBullet"/>
-        <w:spacing w:after="80"/>
-      </w:pPr>
-      <w:r>
-        <w:rPr>
-          <w:b/>
-          <w:color w:val="1A376C"/>
-          <w:sz w:val="21"/>
-        </w:rPr>
-        <w:t>Higher accuracy:</w:t>
-      </w:r>
-      <w:r>
-        <w:rPr>
-          <w:color w:val="404040"/>
-          <w:sz w:val="21"/>
-        </w:rPr>
-        <w:t xml:space="preserve"> Improves delivery verification quality.</w:t>
-      </w:r>
-    </w:p>
-    <w:p>
-      <w:pPr>
-        <w:pStyle w:val="Heading1"/>
-        <w:spacing w:before="280" w:after="120"/>
-        <w:shd w:val="clear" w:color="auto" w:fill="1A376C"/>
-      </w:pPr>
-      <w:r>
-        <w:rPr>
-          <w:b/>
-          <w:color w:val="FFFFFF"/>
-          <w:sz w:val="26"/>
-        </w:rPr>
-        <w:t xml:space="preserve">  7.  Phase 5 — Intelligent Status Automation</w:t>
-      </w:r>
-    </w:p>
-    <w:p>
-      <w:pPr>
-        <w:spacing w:after="120"/>
-      </w:pPr>
-      <w:r>
-        <w:rPr>
-          <w:color w:val="404040"/>
-          <w:sz w:val="21"/>
-        </w:rPr>
-        <w:t>Automate shipment status progression using tracking events and exceptions to minimize manual updates and improve data accuracy.</w:t>
-      </w:r>
-    </w:p>
-    <w:p>
-      <w:pPr>
-        <w:pStyle w:val="Heading2"/>
-        <w:spacing w:before="200" w:after="80"/>
-      </w:pPr>
-      <w:r>
-        <w:rPr>
-          <w:b/>
-          <w:color w:val="007B83"/>
-          <w:sz w:val="22"/>
-        </w:rPr>
-        <w:t>Core Capabilities</w:t>
-      </w:r>
-    </w:p>
-    <w:p>
-      <w:pPr>
-        <w:pStyle w:val="ListBullet"/>
-        <w:spacing w:after="80"/>
-      </w:pPr>
-      <w:r>
-        <w:rPr>
-          <w:b/>
-          <w:color w:val="1A376C"/>
-          <w:sz w:val="21"/>
-        </w:rPr>
-        <w:t>Event-driven progression:</w:t>
-      </w:r>
-      <w:r>
-        <w:rPr>
-          <w:color w:val="404040"/>
-          <w:sz w:val="21"/>
-        </w:rPr>
-        <w:t xml:space="preserve"> Advance statuses based on arrivals, departures, and delivery completion.</w:t>
-      </w:r>
-    </w:p>
-    <w:p>
-      <w:pPr>
-        <w:pStyle w:val="ListBullet"/>
-        <w:spacing w:after="80"/>
-      </w:pPr>
-      <w:r>
-        <w:rPr>
-          <w:b/>
-          <w:color w:val="1A376C"/>
-          <w:sz w:val="21"/>
-        </w:rPr>
-        <w:t>Workflow automation:</w:t>
-      </w:r>
-      <w:r>
-        <w:rPr>
-          <w:color w:val="404040"/>
-          <w:sz w:val="21"/>
-        </w:rPr>
-        <w:t xml:space="preserve"> Reduce user intervention with rules-based status updates.</w:t>
-      </w:r>
-    </w:p>
-    <w:p>
-      <w:pPr>
-        <w:pStyle w:val="ListBullet"/>
-        <w:spacing w:after="80"/>
-      </w:pPr>
-      <w:r>
-        <w:rPr>
-          <w:b/>
-          <w:color w:val="1A376C"/>
-          <w:sz w:val="21"/>
-        </w:rPr>
-        <w:t>Exception detection:</w:t>
-      </w:r>
-      <w:r>
-        <w:rPr>
-          <w:color w:val="404040"/>
-          <w:sz w:val="21"/>
-        </w:rPr>
-        <w:t xml:space="preserve"> Identify delays, route deviations, and unexpected stops.</w:t>
-      </w:r>
-    </w:p>
-    <w:p>
-      <w:pPr>
-        <w:pStyle w:val="Heading2"/>
-        <w:spacing w:before="200" w:after="80"/>
-      </w:pPr>
-      <w:r>
-        <w:rPr>
-          <w:b/>
-          <w:color w:val="007B83"/>
-          <w:sz w:val="22"/>
-        </w:rPr>
-        <w:t>Deliverables</w:t>
-      </w:r>
-    </w:p>
-    <w:p>
-      <w:pPr>
-        <w:pStyle w:val="ListBullet"/>
-        <w:spacing w:after="80"/>
-      </w:pPr>
-      <w:r>
-        <w:rPr>
-          <w:b/>
-          <w:color w:val="1A376C"/>
-          <w:sz w:val="21"/>
-        </w:rPr>
-        <w:t>Status automation engine:</w:t>
-      </w:r>
-      <w:r>
-        <w:rPr>
-          <w:color w:val="404040"/>
-          <w:sz w:val="21"/>
-        </w:rPr>
-        <w:t xml:space="preserve"> Rules-based shipment progression.</w:t>
-      </w:r>
-    </w:p>
-    <w:p>
-      <w:pPr>
-        <w:pStyle w:val="ListBullet"/>
-        <w:spacing w:after="80"/>
-      </w:pPr>
-      <w:r>
-        <w:rPr>
-          <w:b/>
-          <w:color w:val="1A376C"/>
-          <w:sz w:val="21"/>
-        </w:rPr>
-        <w:t>Event processing framework:</w:t>
-      </w:r>
-      <w:r>
-        <w:rPr>
-          <w:color w:val="404040"/>
-          <w:sz w:val="21"/>
-        </w:rPr>
-        <w:t xml:space="preserve"> Unified event handling pipeline.</w:t>
-      </w:r>
-    </w:p>
-    <w:p>
-      <w:pPr>
-        <w:pStyle w:val="ListBullet"/>
-        <w:spacing w:after="80"/>
-      </w:pPr>
-      <w:r>
-        <w:rPr>
-          <w:b/>
-          <w:color w:val="1A376C"/>
-          <w:sz w:val="21"/>
-        </w:rPr>
-        <w:t>Automation rule library:</w:t>
-      </w:r>
-      <w:r>
-        <w:rPr>
-          <w:color w:val="404040"/>
-          <w:sz w:val="21"/>
-        </w:rPr>
-        <w:t xml:space="preserve"> Configurable status triggers.</w:t>
-      </w:r>
-    </w:p>
-    <w:p>
-      <w:pPr>
-        <w:pStyle w:val="Heading2"/>
-        <w:spacing w:before="200" w:after="80"/>
-      </w:pPr>
-      <w:r>
-        <w:rPr>
-          <w:b/>
-          <w:color w:val="007B83"/>
-          <w:sz w:val="22"/>
-        </w:rPr>
-        <w:t>Business Value</w:t>
-      </w:r>
-    </w:p>
-    <w:p>
-      <w:pPr>
-        <w:pStyle w:val="ListBullet"/>
-        <w:spacing w:after="80"/>
-      </w:pPr>
-      <w:r>
-        <w:rPr>
-          <w:b/>
-          <w:color w:val="1A376C"/>
-          <w:sz w:val="21"/>
-        </w:rPr>
-        <w:t>Operational efficiency:</w:t>
-      </w:r>
-      <w:r>
-        <w:rPr>
-          <w:color w:val="404040"/>
-          <w:sz w:val="21"/>
-        </w:rPr>
-        <w:t xml:space="preserve"> Less manual effort and faster updates.</w:t>
-      </w:r>
-    </w:p>
-    <w:p>
-      <w:pPr>
-        <w:pStyle w:val="ListBullet"/>
-        <w:spacing w:after="80"/>
-      </w:pPr>
-      <w:r>
-        <w:rPr>
-          <w:b/>
-          <w:color w:val="1A376C"/>
-          <w:sz w:val="21"/>
-        </w:rPr>
-        <w:t>Data accuracy:</w:t>
-      </w:r>
-      <w:r>
-        <w:rPr>
-          <w:color w:val="404040"/>
-          <w:sz w:val="21"/>
-        </w:rPr>
-        <w:t xml:space="preserve"> Consistent status and milestone reporting.</w:t>
-      </w:r>
-    </w:p>
-    <w:p>
-      <w:pPr>
-        <w:pStyle w:val="Heading1"/>
-        <w:spacing w:before="280" w:after="120"/>
-        <w:shd w:val="clear" w:color="auto" w:fill="1A376C"/>
-      </w:pPr>
-      <w:r>
-        <w:rPr>
-          <w:b/>
-          <w:color w:val="FFFFFF"/>
-          <w:sz w:val="26"/>
-        </w:rPr>
-        <w:t xml:space="preserve">  8.  Phase 6 — Notifications &amp; Alerts</w:t>
-      </w:r>
-    </w:p>
-    <w:p>
-      <w:pPr>
-        <w:spacing w:after="120"/>
-      </w:pPr>
-      <w:r>
-        <w:rPr>
-          <w:color w:val="404040"/>
-          <w:sz w:val="21"/>
-        </w:rPr>
-        <w:t>Keep stakeholders informed with proactive shipment notifications and location-based alerts for critical tracking events.</w:t>
-      </w:r>
-    </w:p>
-    <w:p>
-      <w:pPr>
-        <w:pStyle w:val="Heading2"/>
-        <w:spacing w:before="200" w:after="80"/>
-      </w:pPr>
-      <w:r>
-        <w:rPr>
-          <w:b/>
-          <w:color w:val="007B83"/>
-          <w:sz w:val="22"/>
-        </w:rPr>
-        <w:t>Core Capabilities</w:t>
-      </w:r>
-    </w:p>
-    <w:p>
-      <w:pPr>
-        <w:pStyle w:val="ListBullet"/>
-        <w:spacing w:after="80"/>
-      </w:pPr>
-      <w:r>
-        <w:rPr>
-          <w:b/>
-          <w:color w:val="1A376C"/>
-          <w:sz w:val="21"/>
-        </w:rPr>
-        <w:t>Shipment notifications:</w:t>
-      </w:r>
-      <w:r>
-        <w:rPr>
-          <w:color w:val="404040"/>
-          <w:sz w:val="21"/>
-        </w:rPr>
-        <w:t xml:space="preserve"> Assignment, pickup, transit, delivery updates.</w:t>
-      </w:r>
-    </w:p>
-    <w:p>
-      <w:pPr>
-        <w:pStyle w:val="ListBullet"/>
-        <w:spacing w:after="80"/>
-      </w:pPr>
-      <w:r>
-        <w:rPr>
-          <w:b/>
-          <w:color w:val="1A376C"/>
-          <w:sz w:val="21"/>
-        </w:rPr>
-        <w:t>Location alerts:</w:t>
-      </w:r>
-      <w:r>
-        <w:rPr>
-          <w:color w:val="404040"/>
-          <w:sz w:val="21"/>
-        </w:rPr>
-        <w:t xml:space="preserve"> Arrival and departure notifications for pickup/destination geofences.</w:t>
-      </w:r>
-    </w:p>
-    <w:p>
-      <w:pPr>
-        <w:pStyle w:val="ListBullet"/>
-        <w:spacing w:after="80"/>
-      </w:pPr>
-      <w:r>
-        <w:rPr>
-          <w:b/>
-          <w:color w:val="1A376C"/>
-          <w:sz w:val="21"/>
-        </w:rPr>
-        <w:t>Administrative alerts:</w:t>
-      </w:r>
-      <w:r>
-        <w:rPr>
-          <w:color w:val="404040"/>
-          <w:sz w:val="21"/>
-        </w:rPr>
-        <w:t xml:space="preserve"> Detect tracking interruptions and delay conditions.</w:t>
-      </w:r>
-    </w:p>
-    <w:p>
-      <w:pPr>
-        <w:pStyle w:val="Heading2"/>
-        <w:spacing w:before="200" w:after="80"/>
-      </w:pPr>
-      <w:r>
-        <w:rPr>
-          <w:b/>
-          <w:color w:val="007B83"/>
-          <w:sz w:val="22"/>
-        </w:rPr>
-        <w:t>Deliverables</w:t>
-      </w:r>
-    </w:p>
-    <w:p>
-      <w:pPr>
-        <w:pStyle w:val="ListBullet"/>
-        <w:spacing w:after="80"/>
-      </w:pPr>
-      <w:r>
-        <w:rPr>
-          <w:b/>
-          <w:color w:val="1A376C"/>
-          <w:sz w:val="21"/>
-        </w:rPr>
-        <w:t>Notification service:</w:t>
-      </w:r>
-      <w:r>
-        <w:rPr>
-          <w:color w:val="404040"/>
-          <w:sz w:val="21"/>
-        </w:rPr>
-        <w:t xml:space="preserve"> Multi-channel update engine.</w:t>
-      </w:r>
-    </w:p>
-    <w:p>
-      <w:pPr>
-        <w:pStyle w:val="ListBullet"/>
-        <w:spacing w:after="80"/>
-      </w:pPr>
-      <w:r>
-        <w:rPr>
-          <w:b/>
-          <w:color w:val="1A376C"/>
-          <w:sz w:val="21"/>
-        </w:rPr>
-        <w:t>Alert management:</w:t>
-      </w:r>
-      <w:r>
-        <w:rPr>
-          <w:color w:val="404040"/>
-          <w:sz w:val="21"/>
-        </w:rPr>
-        <w:t xml:space="preserve"> Configurable alert rules and routing.</w:t>
-      </w:r>
-    </w:p>
-    <w:p>
-      <w:pPr>
-        <w:pStyle w:val="ListBullet"/>
-        <w:spacing w:after="80"/>
-      </w:pPr>
-      <w:r>
-        <w:rPr>
-          <w:b/>
-          <w:color w:val="1A376C"/>
-          <w:sz w:val="21"/>
-        </w:rPr>
-        <w:t>User notification center:</w:t>
-      </w:r>
-      <w:r>
-        <w:rPr>
-          <w:color w:val="404040"/>
-          <w:sz w:val="21"/>
-        </w:rPr>
-        <w:t xml:space="preserve"> Centralized notification history.</w:t>
-      </w:r>
-    </w:p>
-    <w:p>
-      <w:pPr>
-        <w:pStyle w:val="Heading2"/>
-        <w:spacing w:before="200" w:after="80"/>
-      </w:pPr>
-      <w:r>
-        <w:rPr>
-          <w:b/>
-          <w:color w:val="007B83"/>
-          <w:sz w:val="22"/>
-        </w:rPr>
-        <w:t>Business Value</w:t>
-      </w:r>
-    </w:p>
-    <w:p>
-      <w:pPr>
-        <w:pStyle w:val="ListBullet"/>
-        <w:spacing w:after="80"/>
-      </w:pPr>
-      <w:r>
-        <w:rPr>
-          <w:b/>
-          <w:color w:val="1A376C"/>
-          <w:sz w:val="21"/>
-        </w:rPr>
-        <w:t>Faster communication:</w:t>
-      </w:r>
-      <w:r>
-        <w:rPr>
-          <w:color w:val="404040"/>
-          <w:sz w:val="21"/>
-        </w:rPr>
-        <w:t xml:space="preserve"> Improves stakeholder awareness.</w:t>
-      </w:r>
-    </w:p>
-    <w:p>
-      <w:pPr>
-        <w:pStyle w:val="ListBullet"/>
-        <w:spacing w:after="80"/>
-      </w:pPr>
-      <w:r>
-        <w:rPr>
-          <w:b/>
-          <w:color w:val="1A376C"/>
-          <w:sz w:val="21"/>
-        </w:rPr>
-        <w:t>Reduced delays:</w:t>
-      </w:r>
-      <w:r>
-        <w:rPr>
-          <w:color w:val="404040"/>
-          <w:sz w:val="21"/>
-        </w:rPr>
-        <w:t xml:space="preserve"> Early warning for operational issues.</w:t>
-      </w:r>
-    </w:p>
-    <w:p>
-      <w:pPr>
-        <w:pStyle w:val="Heading1"/>
-        <w:spacing w:before="280" w:after="120"/>
-        <w:shd w:val="clear" w:color="auto" w:fill="1A376C"/>
-      </w:pPr>
-      <w:r>
-        <w:rPr>
-          <w:b/>
-          <w:color w:val="FFFFFF"/>
-          <w:sz w:val="26"/>
-        </w:rPr>
-        <w:t xml:space="preserve">  9.  Phase 7 — Analytics &amp; Carrier Performance</w:t>
-      </w:r>
-    </w:p>
-    <w:p>
-      <w:pPr>
-        <w:spacing w:after="120"/>
-      </w:pPr>
-      <w:r>
-        <w:rPr>
-          <w:color w:val="404040"/>
-          <w:sz w:val="21"/>
-        </w:rPr>
-        <w:t>Use tracking data to measure carrier performance, vehicle utilization, and service reliability through dashboards and ratings.</w:t>
-      </w:r>
-    </w:p>
-    <w:p>
-      <w:pPr>
-        <w:pStyle w:val="Heading2"/>
-        <w:spacing w:before="200" w:after="80"/>
-      </w:pPr>
-      <w:r>
-        <w:rPr>
-          <w:b/>
-          <w:color w:val="007B83"/>
-          <w:sz w:val="22"/>
-        </w:rPr>
-        <w:t>Core Capabilities</w:t>
-      </w:r>
-    </w:p>
-    <w:p>
-      <w:pPr>
-        <w:pStyle w:val="ListBullet"/>
-        <w:spacing w:after="80"/>
-      </w:pPr>
-      <w:r>
-        <w:rPr>
-          <w:b/>
-          <w:color w:val="1A376C"/>
-          <w:sz w:val="21"/>
-        </w:rPr>
-        <w:t>Performance metrics:</w:t>
-      </w:r>
-      <w:r>
-        <w:rPr>
-          <w:color w:val="404040"/>
-          <w:sz w:val="21"/>
-        </w:rPr>
-        <w:t xml:space="preserve"> On-time delivery, completion rates, and average transit times.</w:t>
-      </w:r>
-    </w:p>
-    <w:p>
-      <w:pPr>
-        <w:pStyle w:val="ListBullet"/>
-        <w:spacing w:after="80"/>
-      </w:pPr>
-      <w:r>
-        <w:rPr>
-          <w:b/>
-          <w:color w:val="1A376C"/>
-          <w:sz w:val="21"/>
-        </w:rPr>
-        <w:t>Utilization insights:</w:t>
-      </w:r>
-      <w:r>
-        <w:rPr>
-          <w:color w:val="404040"/>
-          <w:sz w:val="21"/>
-        </w:rPr>
-        <w:t xml:space="preserve"> Vehicle operating hours, distance traveled, and asset usage.</w:t>
-      </w:r>
-    </w:p>
-    <w:p>
-      <w:pPr>
-        <w:pStyle w:val="ListBullet"/>
-        <w:spacing w:after="80"/>
-      </w:pPr>
-      <w:r>
-        <w:rPr>
-          <w:b/>
-          <w:color w:val="1A376C"/>
-          <w:sz w:val="21"/>
-        </w:rPr>
-        <w:t>Operational dashboards:</w:t>
-      </w:r>
-      <w:r>
-        <w:rPr>
-          <w:color w:val="404040"/>
-          <w:sz w:val="21"/>
-        </w:rPr>
-        <w:t xml:space="preserve"> Fleet and shipment activity reporting for leadership.</w:t>
-      </w:r>
-    </w:p>
-    <w:p>
-      <w:pPr>
-        <w:pStyle w:val="ListBullet"/>
-        <w:spacing w:after="80"/>
-      </w:pPr>
-      <w:r>
-        <w:rPr>
-          <w:b/>
-          <w:color w:val="1A376C"/>
-          <w:sz w:val="21"/>
-        </w:rPr>
-        <w:t>Ratings &amp; reviews:</w:t>
-      </w:r>
-      <w:r>
-        <w:rPr>
-          <w:color w:val="404040"/>
-          <w:sz w:val="21"/>
-        </w:rPr>
-        <w:t xml:space="preserve"> Capture post-delivery feedback and carrier scores.</w:t>
-      </w:r>
-    </w:p>
-    <w:p>
-      <w:pPr>
-        <w:pStyle w:val="Heading2"/>
-        <w:spacing w:before="200" w:after="80"/>
-      </w:pPr>
-      <w:r>
-        <w:rPr>
-          <w:b/>
-          <w:color w:val="007B83"/>
-          <w:sz w:val="22"/>
-        </w:rPr>
-        <w:t>Deliverables</w:t>
-      </w:r>
-    </w:p>
-    <w:p>
-      <w:pPr>
-        <w:pStyle w:val="ListBullet"/>
-        <w:spacing w:after="80"/>
-      </w:pPr>
-      <w:r>
-        <w:rPr>
-          <w:b/>
-          <w:color w:val="1A376C"/>
-          <w:sz w:val="21"/>
-        </w:rPr>
-        <w:t>Performance dashboards:</w:t>
-      </w:r>
-      <w:r>
-        <w:rPr>
-          <w:color w:val="404040"/>
-          <w:sz w:val="21"/>
-        </w:rPr>
-        <w:t xml:space="preserve"> Carrier and fleet analytics.</w:t>
-      </w:r>
-    </w:p>
-    <w:p>
-      <w:pPr>
-        <w:pStyle w:val="ListBullet"/>
-        <w:spacing w:after="80"/>
-      </w:pPr>
-      <w:r>
-        <w:rPr>
-          <w:b/>
-          <w:color w:val="1A376C"/>
-          <w:sz w:val="21"/>
-        </w:rPr>
-        <w:t>Rating system:</w:t>
-      </w:r>
-      <w:r>
-        <w:rPr>
-          <w:color w:val="404040"/>
-          <w:sz w:val="21"/>
-        </w:rPr>
-        <w:t xml:space="preserve"> Post-delivery feedback integration.</w:t>
-      </w:r>
-    </w:p>
-    <w:p>
-      <w:pPr>
-        <w:pStyle w:val="ListBullet"/>
-        <w:spacing w:after="80"/>
-      </w:pPr>
-      <w:r>
-        <w:rPr>
-          <w:b/>
-          <w:color w:val="1A376C"/>
-          <w:sz w:val="21"/>
-        </w:rPr>
-        <w:t>Operational reports:</w:t>
-      </w:r>
-      <w:r>
-        <w:rPr>
-          <w:color w:val="404040"/>
-          <w:sz w:val="21"/>
-        </w:rPr>
-        <w:t xml:space="preserve"> Exportable performance insights.</w:t>
-      </w:r>
-    </w:p>
-    <w:p>
-      <w:pPr>
-        <w:pStyle w:val="Heading2"/>
-        <w:spacing w:before="200" w:after="80"/>
-      </w:pPr>
-      <w:r>
-        <w:rPr>
-          <w:b/>
-          <w:color w:val="007B83"/>
-          <w:sz w:val="22"/>
-        </w:rPr>
-        <w:t>Business Value</w:t>
-      </w:r>
-    </w:p>
-    <w:p>
-      <w:pPr>
-        <w:pStyle w:val="ListBullet"/>
-        <w:spacing w:after="80"/>
-      </w:pPr>
-      <w:r>
-        <w:rPr>
-          <w:b/>
-          <w:color w:val="1A376C"/>
-          <w:sz w:val="21"/>
-        </w:rPr>
-        <w:t>Data-driven decisions:</w:t>
-      </w:r>
-      <w:r>
-        <w:rPr>
-          <w:color w:val="404040"/>
-          <w:sz w:val="21"/>
-        </w:rPr>
-        <w:t xml:space="preserve"> Enables accountability and optimization.</w:t>
-      </w:r>
-    </w:p>
-    <w:p>
-      <w:pPr>
-        <w:pStyle w:val="ListBullet"/>
-        <w:spacing w:after="80"/>
-      </w:pPr>
-      <w:r>
-        <w:rPr>
-          <w:b/>
-          <w:color w:val="1A376C"/>
-          <w:sz w:val="21"/>
-        </w:rPr>
-        <w:t>Service quality visibility:</w:t>
-      </w:r>
-      <w:r>
-        <w:rPr>
-          <w:color w:val="404040"/>
-          <w:sz w:val="21"/>
-        </w:rPr>
-        <w:t xml:space="preserve"> Improves trust and marketplace health.</w:t>
-      </w:r>
-    </w:p>
-    <w:p>
-      <w:pPr>
-        <w:pStyle w:val="Heading1"/>
-        <w:spacing w:before="280" w:after="120"/>
-        <w:shd w:val="clear" w:color="auto" w:fill="1A376C"/>
-      </w:pPr>
-      <w:r>
-        <w:rPr>
-          <w:b/>
-          <w:color w:val="FFFFFF"/>
-          <w:sz w:val="26"/>
-        </w:rPr>
-        <w:t xml:space="preserve">  10.  Strategic Outcome</w:t>
-      </w:r>
-    </w:p>
-    <w:p>
-      <w:pPr>
-        <w:spacing w:after="120"/>
-      </w:pPr>
-      <w:r>
-        <w:rPr>
-          <w:color w:val="404040"/>
-          <w:sz w:val="21"/>
-        </w:rPr>
-        <w:t>This phased approach transforms the platform from shipment management into a fully trackable logistics ecosystem, enabling real-time visibility, verified delivery events, automated workflows, and actionable performance insights.</w:t>
+        <w:t>This approach prioritizes shipment tracking and operational visibility while creating a scalable foundation for future marketplace and logistics intelligence capabilities.</w:t>
       </w:r>
     </w:p>
     <w:sectPr>
@@ -2701,7 +3745,7 @@
         <w:color w:val="007B83"/>
         <w:sz w:val="18"/>
       </w:rPr>
-      <w:t>Fleet Management System  |  Tracking Integration Roadmap</w:t>
+      <w:t>Fleet Management System  |  Tracking Integration &amp; Logistics Platform Enhancement Plan</w:t>
     </w:r>
   </w:p>
 </w:hdr>

</xml_diff>